<commit_message>
Efecto de las Categorías de Producto
Realice e interprete las graficas y tablas del efecto de las categorias por producto
</commit_message>
<xml_diff>
--- a/Proyecto final Analítica.docx
+++ b/Proyecto final Analítica.docx
@@ -2578,6 +2578,7 @@
         <w:jc w:val="both"/>
         <w:rPr>
           <w:rFonts w:ascii="Times New Roman" w:eastAsia="Times New Roman" w:hAnsi="Times New Roman" w:cs="Times New Roman"/>
+          <w:color w:val="000000"/>
           <w:kern w:val="0"/>
           <w:lang w:eastAsia="es-MX"/>
           <w14:ligatures w14:val="none"/>
@@ -2593,6 +2594,31 @@
         </w:rPr>
         <w:t>La magnitud de esta elasticidad indica que aumentos agresivos de precios podrían afectar significativamente el volumen de ventas y, en consecuencia, la participación de mercado.</w:t>
       </w:r>
+    </w:p>
+    <w:p>
+      <w:pPr>
+        <w:spacing w:before="240" w:after="240" w:line="240" w:lineRule="auto"/>
+        <w:jc w:val="both"/>
+        <w:rPr>
+          <w:rFonts w:ascii="Times New Roman" w:eastAsia="Times New Roman" w:hAnsi="Times New Roman" w:cs="Times New Roman"/>
+          <w:color w:val="000000"/>
+          <w:kern w:val="0"/>
+          <w:lang w:eastAsia="es-MX"/>
+          <w14:ligatures w14:val="none"/>
+        </w:rPr>
+      </w:pPr>
+    </w:p>
+    <w:p>
+      <w:pPr>
+        <w:spacing w:before="240" w:after="240" w:line="240" w:lineRule="auto"/>
+        <w:jc w:val="both"/>
+        <w:rPr>
+          <w:rFonts w:ascii="Times New Roman" w:eastAsia="Times New Roman" w:hAnsi="Times New Roman" w:cs="Times New Roman"/>
+          <w:kern w:val="0"/>
+          <w:lang w:eastAsia="es-MX"/>
+          <w14:ligatures w14:val="none"/>
+        </w:rPr>
+      </w:pPr>
     </w:p>
     <w:p>
       <w:pPr>
@@ -2620,6 +2646,7 @@
           <w:lang w:eastAsia="es-MX"/>
           <w14:ligatures w14:val="none"/>
         </w:rPr>
+        <w:lastRenderedPageBreak/>
         <w:t>3.2 Elasticidad Asociada al Costo</w:t>
       </w:r>
     </w:p>
@@ -2642,10 +2669,1211 @@
           <w:lang w:eastAsia="es-MX"/>
           <w14:ligatures w14:val="none"/>
         </w:rPr>
+        <w:t>Por otro lado, el coeficiente del costo fue β = -0.0345 con un p-valor de 0.087. Aunque el efecto es negativo, su significancia estadística es limitada (significativo al 10%,), por lo que no puede afirmarse con total certeza que el costo tenga un impacto directo importante sobre las ventas, sin embargo sugiere que los consumidores responden principalmente al precio final y no directamente a la estructura de costos.</w:t>
+      </w:r>
+    </w:p>
+    <w:p>
+      <w:pPr>
+        <w:spacing w:before="240" w:after="240" w:line="240" w:lineRule="auto"/>
+        <w:jc w:val="both"/>
+        <w:rPr>
+          <w:rFonts w:ascii="Times New Roman" w:eastAsia="Times New Roman" w:hAnsi="Times New Roman" w:cs="Times New Roman"/>
+          <w:color w:val="000000"/>
+          <w:kern w:val="0"/>
+          <w:lang w:eastAsia="es-MX"/>
+          <w14:ligatures w14:val="none"/>
+        </w:rPr>
+      </w:pPr>
+      <w:r>
+        <w:rPr>
+          <w:rFonts w:ascii="Times New Roman" w:eastAsia="Times New Roman" w:hAnsi="Times New Roman" w:cs="Times New Roman"/>
+          <w:color w:val="000000"/>
+          <w:kern w:val="0"/>
+          <w:lang w:eastAsia="es-MX"/>
+          <w14:ligatures w14:val="none"/>
+        </w:rPr>
+        <w:t>En términos empresariales, esto significa que el cliente no percibe los aumentos de costos internos, sino únicamente el precio final del producto. Por ello, incrementos de costos no necesariamente generan caídas en ventas, salvo que dichos incrementos sean trasladados al consumidor mediante aumentos de precio.</w:t>
+      </w:r>
+    </w:p>
+    <w:p>
+      <w:pPr>
+        <w:spacing w:before="480" w:after="120" w:line="240" w:lineRule="auto"/>
+        <w:jc w:val="both"/>
+        <w:outlineLvl w:val="0"/>
+        <w:rPr>
+          <w:rFonts w:ascii="Times New Roman" w:eastAsia="Times New Roman" w:hAnsi="Times New Roman" w:cs="Times New Roman"/>
+          <w:b/>
+          <w:bCs/>
+          <w:kern w:val="36"/>
+          <w:sz w:val="48"/>
+          <w:szCs w:val="48"/>
+          <w:lang w:eastAsia="es-MX"/>
+          <w14:ligatures w14:val="none"/>
+        </w:rPr>
+      </w:pPr>
+      <w:r>
+        <w:rPr>
+          <w:rFonts w:ascii="Times New Roman" w:eastAsia="Times New Roman" w:hAnsi="Times New Roman" w:cs="Times New Roman"/>
+          <w:b/>
+          <w:bCs/>
+          <w:color w:val="000000"/>
+          <w:kern w:val="36"/>
+          <w:lang w:eastAsia="es-MX"/>
+          <w14:ligatures w14:val="none"/>
+        </w:rPr>
+        <w:t>4. Efecto de las Categorías de Producto</w:t>
+      </w:r>
+    </w:p>
+    <w:p>
+      <w:pPr>
+        <w:spacing w:before="240" w:after="240" w:line="240" w:lineRule="auto"/>
+        <w:jc w:val="both"/>
+        <w:rPr>
+          <w:rFonts w:ascii="Times New Roman" w:eastAsia="Times New Roman" w:hAnsi="Times New Roman" w:cs="Times New Roman"/>
+          <w:kern w:val="0"/>
+          <w:lang w:eastAsia="es-MX"/>
+          <w14:ligatures w14:val="none"/>
+        </w:rPr>
+      </w:pPr>
+      <w:r>
+        <w:rPr>
+          <w:rFonts w:ascii="Times New Roman" w:eastAsia="Times New Roman" w:hAnsi="Times New Roman" w:cs="Times New Roman"/>
+          <w:color w:val="000000"/>
+          <w:kern w:val="0"/>
+          <w:lang w:eastAsia="es-MX"/>
+          <w14:ligatures w14:val="none"/>
+        </w:rPr>
+        <w:t>El modelo incorporó variables categóricas para analizar diferencias en comportamiento comercial entre líneas de productos.</w:t>
+      </w:r>
+    </w:p>
+    <w:p>
+      <w:pPr>
+        <w:spacing w:before="240" w:after="240" w:line="240" w:lineRule="auto"/>
+        <w:jc w:val="both"/>
+        <w:rPr>
+          <w:rFonts w:ascii="Times New Roman" w:eastAsia="Times New Roman" w:hAnsi="Times New Roman" w:cs="Times New Roman"/>
+          <w:kern w:val="0"/>
+          <w:lang w:eastAsia="es-MX"/>
+          <w14:ligatures w14:val="none"/>
+        </w:rPr>
+      </w:pPr>
+      <w:r>
+        <w:rPr>
+          <w:rFonts w:ascii="Times New Roman" w:eastAsia="Times New Roman" w:hAnsi="Times New Roman" w:cs="Times New Roman"/>
+          <w:noProof/>
+          <w:color w:val="000000"/>
+          <w:kern w:val="0"/>
+          <w:bdr w:val="none" w:sz="0" w:space="0" w:color="auto" w:frame="1"/>
+          <w:lang w:eastAsia="es-MX"/>
+          <w14:ligatures w14:val="none"/>
+        </w:rPr>
+        <w:drawing>
+          <wp:inline distT="0" distB="0" distL="0" distR="0" wp14:anchorId="74362960" wp14:editId="2F996EA9">
+            <wp:extent cx="4427006" cy="2654300"/>
+            <wp:effectExtent l="0" t="0" r="5715" b="0"/>
+            <wp:docPr id="1059015734" name="Imagen 2"/>
+            <wp:cNvGraphicFramePr>
+              <a:graphicFrameLocks xmlns:a="http://schemas.openxmlformats.org/drawingml/2006/main" noChangeAspect="1"/>
+            </wp:cNvGraphicFramePr>
+            <a:graphic xmlns:a="http://schemas.openxmlformats.org/drawingml/2006/main">
+              <a:graphicData uri="http://schemas.openxmlformats.org/drawingml/2006/picture">
+                <pic:pic xmlns:pic="http://schemas.openxmlformats.org/drawingml/2006/picture">
+                  <pic:nvPicPr>
+                    <pic:cNvPr id="0" name="Picture 3"/>
+                    <pic:cNvPicPr>
+                      <a:picLocks noChangeAspect="1" noChangeArrowheads="1"/>
+                    </pic:cNvPicPr>
+                  </pic:nvPicPr>
+                  <pic:blipFill>
+                    <a:blip r:embed="rId7" cstate="print">
+                      <a:extLst>
+                        <a:ext uri="{28A0092B-C50C-407E-A947-70E740481C1C}">
+                          <a14:useLocalDpi xmlns:a14="http://schemas.microsoft.com/office/drawing/2010/main" val="0"/>
+                        </a:ext>
+                      </a:extLst>
+                    </a:blip>
+                    <a:srcRect/>
+                    <a:stretch>
+                      <a:fillRect/>
+                    </a:stretch>
+                  </pic:blipFill>
+                  <pic:spPr bwMode="auto">
+                    <a:xfrm>
+                      <a:off x="0" y="0"/>
+                      <a:ext cx="4444416" cy="2664738"/>
+                    </a:xfrm>
+                    <a:prstGeom prst="rect">
+                      <a:avLst/>
+                    </a:prstGeom>
+                    <a:noFill/>
+                    <a:ln>
+                      <a:noFill/>
+                    </a:ln>
+                  </pic:spPr>
+                </pic:pic>
+              </a:graphicData>
+            </a:graphic>
+          </wp:inline>
+        </w:drawing>
+      </w:r>
+    </w:p>
+    <w:p>
+      <w:pPr>
+        <w:spacing w:before="240" w:after="240" w:line="240" w:lineRule="auto"/>
+        <w:jc w:val="both"/>
+        <w:rPr>
+          <w:rFonts w:ascii="Times New Roman" w:eastAsia="Times New Roman" w:hAnsi="Times New Roman" w:cs="Times New Roman"/>
+          <w:kern w:val="0"/>
+          <w:lang w:eastAsia="es-MX"/>
+          <w14:ligatures w14:val="none"/>
+        </w:rPr>
+      </w:pPr>
+      <w:r>
+        <w:rPr>
+          <w:rFonts w:ascii="Times New Roman" w:eastAsia="Times New Roman" w:hAnsi="Times New Roman" w:cs="Times New Roman"/>
+          <w:i/>
+          <w:iCs/>
+          <w:color w:val="000000"/>
+          <w:kern w:val="0"/>
+          <w:lang w:eastAsia="es-MX"/>
+          <w14:ligatures w14:val="none"/>
+        </w:rPr>
+        <w:t>Gráfica 2. Ventas diarias por Categoría de producto</w:t>
+      </w:r>
+    </w:p>
+    <w:p>
+      <w:pPr>
+        <w:spacing w:after="240" w:line="240" w:lineRule="auto"/>
+        <w:rPr>
+          <w:rFonts w:ascii="Times New Roman" w:eastAsia="Times New Roman" w:hAnsi="Times New Roman" w:cs="Times New Roman"/>
+          <w:kern w:val="0"/>
+          <w:lang w:eastAsia="es-MX"/>
+          <w14:ligatures w14:val="none"/>
+        </w:rPr>
+      </w:pPr>
+    </w:p>
+    <w:p>
+      <w:pPr>
+        <w:spacing w:after="240" w:line="240" w:lineRule="auto"/>
+        <w:rPr>
+          <w:rFonts w:ascii="Times New Roman" w:eastAsia="Times New Roman" w:hAnsi="Times New Roman" w:cs="Times New Roman"/>
+          <w:kern w:val="0"/>
+          <w:lang w:eastAsia="es-MX"/>
+          <w14:ligatures w14:val="none"/>
+        </w:rPr>
+      </w:pPr>
+    </w:p>
+    <w:p>
+      <w:pPr>
+        <w:spacing w:after="240" w:line="240" w:lineRule="auto"/>
+        <w:rPr>
+          <w:rFonts w:ascii="Times New Roman" w:eastAsia="Times New Roman" w:hAnsi="Times New Roman" w:cs="Times New Roman"/>
+          <w:kern w:val="0"/>
+          <w:lang w:eastAsia="es-MX"/>
+          <w14:ligatures w14:val="none"/>
+        </w:rPr>
+      </w:pPr>
+    </w:p>
+    <w:p>
+      <w:pPr>
+        <w:spacing w:after="240" w:line="240" w:lineRule="auto"/>
+        <w:rPr>
+          <w:rFonts w:ascii="Times New Roman" w:eastAsia="Times New Roman" w:hAnsi="Times New Roman" w:cs="Times New Roman"/>
+          <w:kern w:val="0"/>
+          <w:lang w:eastAsia="es-MX"/>
+          <w14:ligatures w14:val="none"/>
+        </w:rPr>
+      </w:pPr>
+    </w:p>
+    <w:p>
+      <w:pPr>
+        <w:spacing w:after="240" w:line="240" w:lineRule="auto"/>
+        <w:rPr>
+          <w:rFonts w:ascii="Times New Roman" w:eastAsia="Times New Roman" w:hAnsi="Times New Roman" w:cs="Times New Roman"/>
+          <w:kern w:val="0"/>
+          <w:lang w:eastAsia="es-MX"/>
+          <w14:ligatures w14:val="none"/>
+        </w:rPr>
+      </w:pPr>
+    </w:p>
+    <w:p>
+      <w:pPr>
+        <w:spacing w:after="240" w:line="240" w:lineRule="auto"/>
+        <w:rPr>
+          <w:rFonts w:ascii="Times New Roman" w:eastAsia="Times New Roman" w:hAnsi="Times New Roman" w:cs="Times New Roman"/>
+          <w:kern w:val="0"/>
+          <w:lang w:eastAsia="es-MX"/>
+          <w14:ligatures w14:val="none"/>
+        </w:rPr>
+      </w:pPr>
+    </w:p>
+    <w:p>
+      <w:pPr>
+        <w:spacing w:before="240" w:after="240" w:line="240" w:lineRule="auto"/>
+        <w:jc w:val="both"/>
+        <w:rPr>
+          <w:rFonts w:ascii="Times New Roman" w:eastAsia="Times New Roman" w:hAnsi="Times New Roman" w:cs="Times New Roman"/>
+          <w:kern w:val="0"/>
+          <w:lang w:eastAsia="es-MX"/>
+          <w14:ligatures w14:val="none"/>
+        </w:rPr>
+      </w:pPr>
+      <w:r>
+        <w:rPr>
+          <w:rFonts w:ascii="Times New Roman" w:eastAsia="Times New Roman" w:hAnsi="Times New Roman" w:cs="Times New Roman"/>
+          <w:i/>
+          <w:iCs/>
+          <w:color w:val="000000"/>
+          <w:kern w:val="0"/>
+          <w:lang w:eastAsia="es-MX"/>
+          <w14:ligatures w14:val="none"/>
+        </w:rPr>
         <w:lastRenderedPageBreak/>
-        <w:t>Por otro lado, el coeficiente del costo fue β = -0.0345 con un p-valor de 0.087. Aunque el efecto es negativo, su significancia estadística es limitada (significativo al 10%,), por lo que no puede afirmarse con total certeza que el costo tenga un impacto directo importante sobre las ventas, sin embargo sugiere que los consumidores responden principalmente al precio final y no directamente a la estructura de costos.</w:t>
-      </w:r>
-    </w:p>
+        <w:t xml:space="preserve">Tabla 1. Resumen efecto </w:t>
+      </w:r>
+      <w:proofErr w:type="spellStart"/>
+      <w:r>
+        <w:rPr>
+          <w:rFonts w:ascii="Times New Roman" w:eastAsia="Times New Roman" w:hAnsi="Times New Roman" w:cs="Times New Roman"/>
+          <w:i/>
+          <w:iCs/>
+          <w:color w:val="000000"/>
+          <w:kern w:val="0"/>
+          <w:lang w:eastAsia="es-MX"/>
+          <w14:ligatures w14:val="none"/>
+        </w:rPr>
+        <w:t>categorias</w:t>
+      </w:r>
+      <w:proofErr w:type="spellEnd"/>
+      <w:r>
+        <w:rPr>
+          <w:rFonts w:ascii="Times New Roman" w:eastAsia="Times New Roman" w:hAnsi="Times New Roman" w:cs="Times New Roman"/>
+          <w:i/>
+          <w:iCs/>
+          <w:color w:val="000000"/>
+          <w:kern w:val="0"/>
+          <w:lang w:eastAsia="es-MX"/>
+          <w14:ligatures w14:val="none"/>
+        </w:rPr>
+        <w:t xml:space="preserve"> por producto</w:t>
+      </w:r>
+    </w:p>
+    <w:tbl>
+      <w:tblPr>
+        <w:tblW w:w="9073" w:type="dxa"/>
+        <w:tblCellMar>
+          <w:top w:w="15" w:type="dxa"/>
+          <w:left w:w="15" w:type="dxa"/>
+          <w:bottom w:w="15" w:type="dxa"/>
+          <w:right w:w="15" w:type="dxa"/>
+        </w:tblCellMar>
+        <w:tblLook w:val="04A0" w:firstRow="1" w:lastRow="0" w:firstColumn="1" w:lastColumn="0" w:noHBand="0" w:noVBand="1"/>
+      </w:tblPr>
+      <w:tblGrid>
+        <w:gridCol w:w="2206"/>
+        <w:gridCol w:w="2451"/>
+        <w:gridCol w:w="4416"/>
+      </w:tblGrid>
+      <w:tr>
+        <w:trPr>
+          <w:trHeight w:val="168"/>
+        </w:trPr>
+        <w:tc>
+          <w:tcPr>
+            <w:tcW w:w="0" w:type="auto"/>
+            <w:tcBorders>
+              <w:top w:val="single" w:sz="4" w:space="0" w:color="000000"/>
+              <w:left w:val="single" w:sz="4" w:space="0" w:color="000000"/>
+              <w:bottom w:val="single" w:sz="4" w:space="0" w:color="000000"/>
+              <w:right w:val="single" w:sz="4" w:space="0" w:color="000000"/>
+            </w:tcBorders>
+            <w:tcMar>
+              <w:top w:w="100" w:type="dxa"/>
+              <w:left w:w="100" w:type="dxa"/>
+              <w:bottom w:w="100" w:type="dxa"/>
+              <w:right w:w="100" w:type="dxa"/>
+            </w:tcMar>
+            <w:hideMark/>
+          </w:tcPr>
+          <w:p>
+            <w:pPr>
+              <w:spacing w:before="240" w:after="240" w:line="240" w:lineRule="auto"/>
+              <w:jc w:val="both"/>
+              <w:rPr>
+                <w:rFonts w:ascii="Times New Roman" w:eastAsia="Times New Roman" w:hAnsi="Times New Roman" w:cs="Times New Roman"/>
+                <w:kern w:val="0"/>
+                <w:lang w:eastAsia="es-MX"/>
+                <w14:ligatures w14:val="none"/>
+              </w:rPr>
+            </w:pPr>
+            <w:r>
+              <w:rPr>
+                <w:rFonts w:ascii="Times New Roman" w:eastAsia="Times New Roman" w:hAnsi="Times New Roman" w:cs="Times New Roman"/>
+                <w:b/>
+                <w:bCs/>
+                <w:color w:val="000000"/>
+                <w:kern w:val="0"/>
+                <w:lang w:eastAsia="es-MX"/>
+                <w14:ligatures w14:val="none"/>
+              </w:rPr>
+              <w:t>Categoría</w:t>
+            </w:r>
+          </w:p>
+        </w:tc>
+        <w:tc>
+          <w:tcPr>
+            <w:tcW w:w="0" w:type="auto"/>
+            <w:tcBorders>
+              <w:top w:val="single" w:sz="4" w:space="0" w:color="000000"/>
+              <w:left w:val="single" w:sz="4" w:space="0" w:color="000000"/>
+              <w:bottom w:val="single" w:sz="4" w:space="0" w:color="000000"/>
+              <w:right w:val="single" w:sz="4" w:space="0" w:color="000000"/>
+            </w:tcBorders>
+            <w:tcMar>
+              <w:top w:w="100" w:type="dxa"/>
+              <w:left w:w="100" w:type="dxa"/>
+              <w:bottom w:w="100" w:type="dxa"/>
+              <w:right w:w="100" w:type="dxa"/>
+            </w:tcMar>
+            <w:hideMark/>
+          </w:tcPr>
+          <w:p>
+            <w:pPr>
+              <w:spacing w:before="240" w:after="240" w:line="240" w:lineRule="auto"/>
+              <w:jc w:val="both"/>
+              <w:rPr>
+                <w:rFonts w:ascii="Times New Roman" w:eastAsia="Times New Roman" w:hAnsi="Times New Roman" w:cs="Times New Roman"/>
+                <w:kern w:val="0"/>
+                <w:lang w:eastAsia="es-MX"/>
+                <w14:ligatures w14:val="none"/>
+              </w:rPr>
+            </w:pPr>
+            <w:r>
+              <w:rPr>
+                <w:rFonts w:ascii="Times New Roman" w:eastAsia="Times New Roman" w:hAnsi="Times New Roman" w:cs="Times New Roman"/>
+                <w:b/>
+                <w:bCs/>
+                <w:color w:val="000000"/>
+                <w:kern w:val="0"/>
+                <w:lang w:eastAsia="es-MX"/>
+                <w14:ligatures w14:val="none"/>
+              </w:rPr>
+              <w:t>Coeficiente</w:t>
+            </w:r>
+          </w:p>
+        </w:tc>
+        <w:tc>
+          <w:tcPr>
+            <w:tcW w:w="0" w:type="auto"/>
+            <w:tcBorders>
+              <w:top w:val="single" w:sz="4" w:space="0" w:color="000000"/>
+              <w:left w:val="single" w:sz="4" w:space="0" w:color="000000"/>
+              <w:bottom w:val="single" w:sz="4" w:space="0" w:color="000000"/>
+              <w:right w:val="single" w:sz="4" w:space="0" w:color="000000"/>
+            </w:tcBorders>
+            <w:tcMar>
+              <w:top w:w="100" w:type="dxa"/>
+              <w:left w:w="100" w:type="dxa"/>
+              <w:bottom w:w="100" w:type="dxa"/>
+              <w:right w:w="100" w:type="dxa"/>
+            </w:tcMar>
+            <w:hideMark/>
+          </w:tcPr>
+          <w:p>
+            <w:pPr>
+              <w:spacing w:before="240" w:after="240" w:line="240" w:lineRule="auto"/>
+              <w:jc w:val="both"/>
+              <w:rPr>
+                <w:rFonts w:ascii="Times New Roman" w:eastAsia="Times New Roman" w:hAnsi="Times New Roman" w:cs="Times New Roman"/>
+                <w:kern w:val="0"/>
+                <w:lang w:eastAsia="es-MX"/>
+                <w14:ligatures w14:val="none"/>
+              </w:rPr>
+            </w:pPr>
+            <w:r>
+              <w:rPr>
+                <w:rFonts w:ascii="Times New Roman" w:eastAsia="Times New Roman" w:hAnsi="Times New Roman" w:cs="Times New Roman"/>
+                <w:b/>
+                <w:bCs/>
+                <w:color w:val="000000"/>
+                <w:kern w:val="0"/>
+                <w:lang w:eastAsia="es-MX"/>
+                <w14:ligatures w14:val="none"/>
+              </w:rPr>
+              <w:t>Resultado</w:t>
+            </w:r>
+          </w:p>
+        </w:tc>
+      </w:tr>
+      <w:tr>
+        <w:trPr>
+          <w:trHeight w:val="388"/>
+        </w:trPr>
+        <w:tc>
+          <w:tcPr>
+            <w:tcW w:w="0" w:type="auto"/>
+            <w:tcBorders>
+              <w:top w:val="single" w:sz="4" w:space="0" w:color="000000"/>
+              <w:left w:val="single" w:sz="4" w:space="0" w:color="000000"/>
+              <w:bottom w:val="single" w:sz="4" w:space="0" w:color="000000"/>
+              <w:right w:val="single" w:sz="4" w:space="0" w:color="000000"/>
+            </w:tcBorders>
+            <w:tcMar>
+              <w:top w:w="100" w:type="dxa"/>
+              <w:left w:w="100" w:type="dxa"/>
+              <w:bottom w:w="100" w:type="dxa"/>
+              <w:right w:w="100" w:type="dxa"/>
+            </w:tcMar>
+            <w:hideMark/>
+          </w:tcPr>
+          <w:p>
+            <w:pPr>
+              <w:spacing w:before="240" w:after="240" w:line="240" w:lineRule="auto"/>
+              <w:jc w:val="both"/>
+              <w:rPr>
+                <w:rFonts w:ascii="Times New Roman" w:eastAsia="Times New Roman" w:hAnsi="Times New Roman" w:cs="Times New Roman"/>
+                <w:kern w:val="0"/>
+                <w:lang w:eastAsia="es-MX"/>
+                <w14:ligatures w14:val="none"/>
+              </w:rPr>
+            </w:pPr>
+            <w:proofErr w:type="spellStart"/>
+            <w:r>
+              <w:rPr>
+                <w:rFonts w:ascii="Times New Roman" w:eastAsia="Times New Roman" w:hAnsi="Times New Roman" w:cs="Times New Roman"/>
+                <w:color w:val="000000"/>
+                <w:kern w:val="0"/>
+                <w:lang w:eastAsia="es-MX"/>
+                <w14:ligatures w14:val="none"/>
+              </w:rPr>
+              <w:t>Jacket</w:t>
+            </w:r>
+            <w:proofErr w:type="spellEnd"/>
+          </w:p>
+        </w:tc>
+        <w:tc>
+          <w:tcPr>
+            <w:tcW w:w="0" w:type="auto"/>
+            <w:tcBorders>
+              <w:top w:val="single" w:sz="4" w:space="0" w:color="000000"/>
+              <w:left w:val="single" w:sz="4" w:space="0" w:color="000000"/>
+              <w:bottom w:val="single" w:sz="4" w:space="0" w:color="000000"/>
+              <w:right w:val="single" w:sz="4" w:space="0" w:color="000000"/>
+            </w:tcBorders>
+            <w:tcMar>
+              <w:top w:w="100" w:type="dxa"/>
+              <w:left w:w="100" w:type="dxa"/>
+              <w:bottom w:w="100" w:type="dxa"/>
+              <w:right w:w="100" w:type="dxa"/>
+            </w:tcMar>
+            <w:hideMark/>
+          </w:tcPr>
+          <w:p>
+            <w:pPr>
+              <w:spacing w:before="240" w:after="240" w:line="240" w:lineRule="auto"/>
+              <w:jc w:val="both"/>
+              <w:rPr>
+                <w:rFonts w:ascii="Times New Roman" w:eastAsia="Times New Roman" w:hAnsi="Times New Roman" w:cs="Times New Roman"/>
+                <w:kern w:val="0"/>
+                <w:lang w:eastAsia="es-MX"/>
+                <w14:ligatures w14:val="none"/>
+              </w:rPr>
+            </w:pPr>
+            <w:r>
+              <w:rPr>
+                <w:rFonts w:ascii="Times New Roman" w:eastAsia="Times New Roman" w:hAnsi="Times New Roman" w:cs="Times New Roman"/>
+                <w:color w:val="000000"/>
+                <w:kern w:val="0"/>
+                <w:lang w:eastAsia="es-MX"/>
+                <w14:ligatures w14:val="none"/>
+              </w:rPr>
+              <w:t>0.0704</w:t>
+            </w:r>
+          </w:p>
+        </w:tc>
+        <w:tc>
+          <w:tcPr>
+            <w:tcW w:w="0" w:type="auto"/>
+            <w:tcBorders>
+              <w:top w:val="single" w:sz="4" w:space="0" w:color="000000"/>
+              <w:left w:val="single" w:sz="4" w:space="0" w:color="000000"/>
+              <w:bottom w:val="single" w:sz="4" w:space="0" w:color="000000"/>
+              <w:right w:val="single" w:sz="4" w:space="0" w:color="000000"/>
+            </w:tcBorders>
+            <w:tcMar>
+              <w:top w:w="100" w:type="dxa"/>
+              <w:left w:w="100" w:type="dxa"/>
+              <w:bottom w:w="100" w:type="dxa"/>
+              <w:right w:w="100" w:type="dxa"/>
+            </w:tcMar>
+            <w:hideMark/>
+          </w:tcPr>
+          <w:p>
+            <w:pPr>
+              <w:spacing w:before="240" w:after="240" w:line="240" w:lineRule="auto"/>
+              <w:jc w:val="both"/>
+              <w:rPr>
+                <w:rFonts w:ascii="Times New Roman" w:eastAsia="Times New Roman" w:hAnsi="Times New Roman" w:cs="Times New Roman"/>
+                <w:kern w:val="0"/>
+                <w:lang w:eastAsia="es-MX"/>
+                <w14:ligatures w14:val="none"/>
+              </w:rPr>
+            </w:pPr>
+            <w:r>
+              <w:rPr>
+                <w:rFonts w:ascii="Times New Roman" w:eastAsia="Times New Roman" w:hAnsi="Times New Roman" w:cs="Times New Roman"/>
+                <w:color w:val="000000"/>
+                <w:kern w:val="0"/>
+                <w:lang w:eastAsia="es-MX"/>
+                <w14:ligatures w14:val="none"/>
+              </w:rPr>
+              <w:t>Positivo y significativo</w:t>
+            </w:r>
+          </w:p>
+        </w:tc>
+      </w:tr>
+      <w:tr>
+        <w:trPr>
+          <w:trHeight w:val="260"/>
+        </w:trPr>
+        <w:tc>
+          <w:tcPr>
+            <w:tcW w:w="0" w:type="auto"/>
+            <w:tcBorders>
+              <w:top w:val="single" w:sz="4" w:space="0" w:color="000000"/>
+              <w:left w:val="single" w:sz="4" w:space="0" w:color="000000"/>
+              <w:bottom w:val="single" w:sz="4" w:space="0" w:color="000000"/>
+              <w:right w:val="single" w:sz="4" w:space="0" w:color="000000"/>
+            </w:tcBorders>
+            <w:tcMar>
+              <w:top w:w="100" w:type="dxa"/>
+              <w:left w:w="100" w:type="dxa"/>
+              <w:bottom w:w="100" w:type="dxa"/>
+              <w:right w:w="100" w:type="dxa"/>
+            </w:tcMar>
+            <w:hideMark/>
+          </w:tcPr>
+          <w:p>
+            <w:pPr>
+              <w:spacing w:before="240" w:after="240" w:line="240" w:lineRule="auto"/>
+              <w:jc w:val="both"/>
+              <w:rPr>
+                <w:rFonts w:ascii="Times New Roman" w:eastAsia="Times New Roman" w:hAnsi="Times New Roman" w:cs="Times New Roman"/>
+                <w:kern w:val="0"/>
+                <w:lang w:eastAsia="es-MX"/>
+                <w14:ligatures w14:val="none"/>
+              </w:rPr>
+            </w:pPr>
+            <w:r>
+              <w:rPr>
+                <w:rFonts w:ascii="Times New Roman" w:eastAsia="Times New Roman" w:hAnsi="Times New Roman" w:cs="Times New Roman"/>
+                <w:color w:val="000000"/>
+                <w:kern w:val="0"/>
+                <w:lang w:eastAsia="es-MX"/>
+                <w14:ligatures w14:val="none"/>
+              </w:rPr>
+              <w:t>Jeans</w:t>
+            </w:r>
+          </w:p>
+        </w:tc>
+        <w:tc>
+          <w:tcPr>
+            <w:tcW w:w="0" w:type="auto"/>
+            <w:tcBorders>
+              <w:top w:val="single" w:sz="4" w:space="0" w:color="000000"/>
+              <w:left w:val="single" w:sz="4" w:space="0" w:color="000000"/>
+              <w:bottom w:val="single" w:sz="4" w:space="0" w:color="000000"/>
+              <w:right w:val="single" w:sz="4" w:space="0" w:color="000000"/>
+            </w:tcBorders>
+            <w:tcMar>
+              <w:top w:w="100" w:type="dxa"/>
+              <w:left w:w="100" w:type="dxa"/>
+              <w:bottom w:w="100" w:type="dxa"/>
+              <w:right w:w="100" w:type="dxa"/>
+            </w:tcMar>
+            <w:hideMark/>
+          </w:tcPr>
+          <w:p>
+            <w:pPr>
+              <w:spacing w:before="240" w:after="240" w:line="240" w:lineRule="auto"/>
+              <w:jc w:val="both"/>
+              <w:rPr>
+                <w:rFonts w:ascii="Times New Roman" w:eastAsia="Times New Roman" w:hAnsi="Times New Roman" w:cs="Times New Roman"/>
+                <w:kern w:val="0"/>
+                <w:lang w:eastAsia="es-MX"/>
+                <w14:ligatures w14:val="none"/>
+              </w:rPr>
+            </w:pPr>
+            <w:r>
+              <w:rPr>
+                <w:rFonts w:ascii="Times New Roman" w:eastAsia="Times New Roman" w:hAnsi="Times New Roman" w:cs="Times New Roman"/>
+                <w:color w:val="000000"/>
+                <w:kern w:val="0"/>
+                <w:lang w:eastAsia="es-MX"/>
+                <w14:ligatures w14:val="none"/>
+              </w:rPr>
+              <w:t>0.044</w:t>
+            </w:r>
+          </w:p>
+        </w:tc>
+        <w:tc>
+          <w:tcPr>
+            <w:tcW w:w="0" w:type="auto"/>
+            <w:tcBorders>
+              <w:top w:val="single" w:sz="4" w:space="0" w:color="000000"/>
+              <w:left w:val="single" w:sz="4" w:space="0" w:color="000000"/>
+              <w:bottom w:val="single" w:sz="4" w:space="0" w:color="000000"/>
+              <w:right w:val="single" w:sz="4" w:space="0" w:color="000000"/>
+            </w:tcBorders>
+            <w:tcMar>
+              <w:top w:w="100" w:type="dxa"/>
+              <w:left w:w="100" w:type="dxa"/>
+              <w:bottom w:w="100" w:type="dxa"/>
+              <w:right w:w="100" w:type="dxa"/>
+            </w:tcMar>
+            <w:hideMark/>
+          </w:tcPr>
+          <w:p>
+            <w:pPr>
+              <w:spacing w:before="240" w:after="240" w:line="240" w:lineRule="auto"/>
+              <w:jc w:val="both"/>
+              <w:rPr>
+                <w:rFonts w:ascii="Times New Roman" w:eastAsia="Times New Roman" w:hAnsi="Times New Roman" w:cs="Times New Roman"/>
+                <w:kern w:val="0"/>
+                <w:lang w:eastAsia="es-MX"/>
+                <w14:ligatures w14:val="none"/>
+              </w:rPr>
+            </w:pPr>
+            <w:r>
+              <w:rPr>
+                <w:rFonts w:ascii="Times New Roman" w:eastAsia="Times New Roman" w:hAnsi="Times New Roman" w:cs="Times New Roman"/>
+                <w:color w:val="000000"/>
+                <w:kern w:val="0"/>
+                <w:lang w:eastAsia="es-MX"/>
+                <w14:ligatures w14:val="none"/>
+              </w:rPr>
+              <w:t>Positivo marginal</w:t>
+            </w:r>
+          </w:p>
+        </w:tc>
+      </w:tr>
+      <w:tr>
+        <w:trPr>
+          <w:trHeight w:val="357"/>
+        </w:trPr>
+        <w:tc>
+          <w:tcPr>
+            <w:tcW w:w="0" w:type="auto"/>
+            <w:tcBorders>
+              <w:top w:val="single" w:sz="4" w:space="0" w:color="000000"/>
+              <w:left w:val="single" w:sz="4" w:space="0" w:color="000000"/>
+              <w:bottom w:val="single" w:sz="4" w:space="0" w:color="000000"/>
+              <w:right w:val="single" w:sz="4" w:space="0" w:color="000000"/>
+            </w:tcBorders>
+            <w:tcMar>
+              <w:top w:w="100" w:type="dxa"/>
+              <w:left w:w="100" w:type="dxa"/>
+              <w:bottom w:w="100" w:type="dxa"/>
+              <w:right w:w="100" w:type="dxa"/>
+            </w:tcMar>
+            <w:hideMark/>
+          </w:tcPr>
+          <w:p>
+            <w:pPr>
+              <w:spacing w:before="240" w:after="240" w:line="240" w:lineRule="auto"/>
+              <w:jc w:val="both"/>
+              <w:rPr>
+                <w:rFonts w:ascii="Times New Roman" w:eastAsia="Times New Roman" w:hAnsi="Times New Roman" w:cs="Times New Roman"/>
+                <w:kern w:val="0"/>
+                <w:lang w:eastAsia="es-MX"/>
+                <w14:ligatures w14:val="none"/>
+              </w:rPr>
+            </w:pPr>
+            <w:proofErr w:type="spellStart"/>
+            <w:r>
+              <w:rPr>
+                <w:rFonts w:ascii="Times New Roman" w:eastAsia="Times New Roman" w:hAnsi="Times New Roman" w:cs="Times New Roman"/>
+                <w:color w:val="000000"/>
+                <w:kern w:val="0"/>
+                <w:lang w:eastAsia="es-MX"/>
+                <w14:ligatures w14:val="none"/>
+              </w:rPr>
+              <w:t>Shoes</w:t>
+            </w:r>
+            <w:proofErr w:type="spellEnd"/>
+          </w:p>
+        </w:tc>
+        <w:tc>
+          <w:tcPr>
+            <w:tcW w:w="0" w:type="auto"/>
+            <w:tcBorders>
+              <w:top w:val="single" w:sz="4" w:space="0" w:color="000000"/>
+              <w:left w:val="single" w:sz="4" w:space="0" w:color="000000"/>
+              <w:bottom w:val="single" w:sz="4" w:space="0" w:color="000000"/>
+              <w:right w:val="single" w:sz="4" w:space="0" w:color="000000"/>
+            </w:tcBorders>
+            <w:tcMar>
+              <w:top w:w="100" w:type="dxa"/>
+              <w:left w:w="100" w:type="dxa"/>
+              <w:bottom w:w="100" w:type="dxa"/>
+              <w:right w:w="100" w:type="dxa"/>
+            </w:tcMar>
+            <w:hideMark/>
+          </w:tcPr>
+          <w:p>
+            <w:pPr>
+              <w:spacing w:before="240" w:after="240" w:line="240" w:lineRule="auto"/>
+              <w:jc w:val="both"/>
+              <w:rPr>
+                <w:rFonts w:ascii="Times New Roman" w:eastAsia="Times New Roman" w:hAnsi="Times New Roman" w:cs="Times New Roman"/>
+                <w:kern w:val="0"/>
+                <w:lang w:eastAsia="es-MX"/>
+                <w14:ligatures w14:val="none"/>
+              </w:rPr>
+            </w:pPr>
+            <w:r>
+              <w:rPr>
+                <w:rFonts w:ascii="Times New Roman" w:eastAsia="Times New Roman" w:hAnsi="Times New Roman" w:cs="Times New Roman"/>
+                <w:color w:val="000000"/>
+                <w:kern w:val="0"/>
+                <w:lang w:eastAsia="es-MX"/>
+                <w14:ligatures w14:val="none"/>
+              </w:rPr>
+              <w:t>0.1132</w:t>
+            </w:r>
+          </w:p>
+        </w:tc>
+        <w:tc>
+          <w:tcPr>
+            <w:tcW w:w="0" w:type="auto"/>
+            <w:tcBorders>
+              <w:top w:val="single" w:sz="4" w:space="0" w:color="000000"/>
+              <w:left w:val="single" w:sz="4" w:space="0" w:color="000000"/>
+              <w:bottom w:val="single" w:sz="4" w:space="0" w:color="000000"/>
+              <w:right w:val="single" w:sz="4" w:space="0" w:color="000000"/>
+            </w:tcBorders>
+            <w:tcMar>
+              <w:top w:w="100" w:type="dxa"/>
+              <w:left w:w="100" w:type="dxa"/>
+              <w:bottom w:w="100" w:type="dxa"/>
+              <w:right w:w="100" w:type="dxa"/>
+            </w:tcMar>
+            <w:hideMark/>
+          </w:tcPr>
+          <w:p>
+            <w:pPr>
+              <w:spacing w:before="240" w:after="240" w:line="240" w:lineRule="auto"/>
+              <w:jc w:val="both"/>
+              <w:rPr>
+                <w:rFonts w:ascii="Times New Roman" w:eastAsia="Times New Roman" w:hAnsi="Times New Roman" w:cs="Times New Roman"/>
+                <w:kern w:val="0"/>
+                <w:lang w:eastAsia="es-MX"/>
+                <w14:ligatures w14:val="none"/>
+              </w:rPr>
+            </w:pPr>
+            <w:r>
+              <w:rPr>
+                <w:rFonts w:ascii="Times New Roman" w:eastAsia="Times New Roman" w:hAnsi="Times New Roman" w:cs="Times New Roman"/>
+                <w:color w:val="000000"/>
+                <w:kern w:val="0"/>
+                <w:lang w:eastAsia="es-MX"/>
+                <w14:ligatures w14:val="none"/>
+              </w:rPr>
+              <w:t>Alto impacto positivo</w:t>
+            </w:r>
+          </w:p>
+        </w:tc>
+      </w:tr>
+      <w:tr>
+        <w:trPr>
+          <w:trHeight w:val="260"/>
+        </w:trPr>
+        <w:tc>
+          <w:tcPr>
+            <w:tcW w:w="0" w:type="auto"/>
+            <w:tcBorders>
+              <w:top w:val="single" w:sz="4" w:space="0" w:color="000000"/>
+              <w:left w:val="single" w:sz="4" w:space="0" w:color="000000"/>
+              <w:bottom w:val="single" w:sz="4" w:space="0" w:color="000000"/>
+              <w:right w:val="single" w:sz="4" w:space="0" w:color="000000"/>
+            </w:tcBorders>
+            <w:tcMar>
+              <w:top w:w="100" w:type="dxa"/>
+              <w:left w:w="100" w:type="dxa"/>
+              <w:bottom w:w="100" w:type="dxa"/>
+              <w:right w:w="100" w:type="dxa"/>
+            </w:tcMar>
+            <w:hideMark/>
+          </w:tcPr>
+          <w:p>
+            <w:pPr>
+              <w:spacing w:before="240" w:after="240" w:line="240" w:lineRule="auto"/>
+              <w:jc w:val="both"/>
+              <w:rPr>
+                <w:rFonts w:ascii="Times New Roman" w:eastAsia="Times New Roman" w:hAnsi="Times New Roman" w:cs="Times New Roman"/>
+                <w:kern w:val="0"/>
+                <w:lang w:eastAsia="es-MX"/>
+                <w14:ligatures w14:val="none"/>
+              </w:rPr>
+            </w:pPr>
+            <w:r>
+              <w:rPr>
+                <w:rFonts w:ascii="Times New Roman" w:eastAsia="Times New Roman" w:hAnsi="Times New Roman" w:cs="Times New Roman"/>
+                <w:color w:val="000000"/>
+                <w:kern w:val="0"/>
+                <w:lang w:eastAsia="es-MX"/>
+                <w14:ligatures w14:val="none"/>
+              </w:rPr>
+              <w:t>T-</w:t>
+            </w:r>
+            <w:proofErr w:type="spellStart"/>
+            <w:r>
+              <w:rPr>
+                <w:rFonts w:ascii="Times New Roman" w:eastAsia="Times New Roman" w:hAnsi="Times New Roman" w:cs="Times New Roman"/>
+                <w:color w:val="000000"/>
+                <w:kern w:val="0"/>
+                <w:lang w:eastAsia="es-MX"/>
+                <w14:ligatures w14:val="none"/>
+              </w:rPr>
+              <w:t>shirt</w:t>
+            </w:r>
+            <w:proofErr w:type="spellEnd"/>
+          </w:p>
+        </w:tc>
+        <w:tc>
+          <w:tcPr>
+            <w:tcW w:w="0" w:type="auto"/>
+            <w:tcBorders>
+              <w:top w:val="single" w:sz="4" w:space="0" w:color="000000"/>
+              <w:left w:val="single" w:sz="4" w:space="0" w:color="000000"/>
+              <w:bottom w:val="single" w:sz="4" w:space="0" w:color="000000"/>
+              <w:right w:val="single" w:sz="4" w:space="0" w:color="000000"/>
+            </w:tcBorders>
+            <w:tcMar>
+              <w:top w:w="100" w:type="dxa"/>
+              <w:left w:w="100" w:type="dxa"/>
+              <w:bottom w:w="100" w:type="dxa"/>
+              <w:right w:w="100" w:type="dxa"/>
+            </w:tcMar>
+            <w:hideMark/>
+          </w:tcPr>
+          <w:p>
+            <w:pPr>
+              <w:spacing w:before="240" w:after="240" w:line="240" w:lineRule="auto"/>
+              <w:jc w:val="both"/>
+              <w:rPr>
+                <w:rFonts w:ascii="Times New Roman" w:eastAsia="Times New Roman" w:hAnsi="Times New Roman" w:cs="Times New Roman"/>
+                <w:kern w:val="0"/>
+                <w:lang w:eastAsia="es-MX"/>
+                <w14:ligatures w14:val="none"/>
+              </w:rPr>
+            </w:pPr>
+            <w:r>
+              <w:rPr>
+                <w:rFonts w:ascii="Times New Roman" w:eastAsia="Times New Roman" w:hAnsi="Times New Roman" w:cs="Times New Roman"/>
+                <w:color w:val="000000"/>
+                <w:kern w:val="0"/>
+                <w:lang w:eastAsia="es-MX"/>
+                <w14:ligatures w14:val="none"/>
+              </w:rPr>
+              <w:t>-0.0385</w:t>
+            </w:r>
+          </w:p>
+        </w:tc>
+        <w:tc>
+          <w:tcPr>
+            <w:tcW w:w="0" w:type="auto"/>
+            <w:tcBorders>
+              <w:top w:val="single" w:sz="4" w:space="0" w:color="000000"/>
+              <w:left w:val="single" w:sz="4" w:space="0" w:color="000000"/>
+              <w:bottom w:val="single" w:sz="4" w:space="0" w:color="000000"/>
+              <w:right w:val="single" w:sz="4" w:space="0" w:color="000000"/>
+            </w:tcBorders>
+            <w:tcMar>
+              <w:top w:w="100" w:type="dxa"/>
+              <w:left w:w="100" w:type="dxa"/>
+              <w:bottom w:w="100" w:type="dxa"/>
+              <w:right w:w="100" w:type="dxa"/>
+            </w:tcMar>
+            <w:hideMark/>
+          </w:tcPr>
+          <w:p>
+            <w:pPr>
+              <w:spacing w:before="240" w:after="240" w:line="240" w:lineRule="auto"/>
+              <w:jc w:val="both"/>
+              <w:rPr>
+                <w:rFonts w:ascii="Times New Roman" w:eastAsia="Times New Roman" w:hAnsi="Times New Roman" w:cs="Times New Roman"/>
+                <w:kern w:val="0"/>
+                <w:lang w:eastAsia="es-MX"/>
+                <w14:ligatures w14:val="none"/>
+              </w:rPr>
+            </w:pPr>
+            <w:r>
+              <w:rPr>
+                <w:rFonts w:ascii="Times New Roman" w:eastAsia="Times New Roman" w:hAnsi="Times New Roman" w:cs="Times New Roman"/>
+                <w:color w:val="000000"/>
+                <w:kern w:val="0"/>
+                <w:lang w:eastAsia="es-MX"/>
+                <w14:ligatures w14:val="none"/>
+              </w:rPr>
+              <w:t>No significativo</w:t>
+            </w:r>
+          </w:p>
+        </w:tc>
+      </w:tr>
+      <w:tr>
+        <w:trPr>
+          <w:trHeight w:val="260"/>
+        </w:trPr>
+        <w:tc>
+          <w:tcPr>
+            <w:tcW w:w="0" w:type="auto"/>
+            <w:tcBorders>
+              <w:top w:val="single" w:sz="4" w:space="0" w:color="000000"/>
+              <w:left w:val="single" w:sz="4" w:space="0" w:color="000000"/>
+              <w:bottom w:val="single" w:sz="4" w:space="0" w:color="000000"/>
+              <w:right w:val="single" w:sz="4" w:space="0" w:color="000000"/>
+            </w:tcBorders>
+            <w:tcMar>
+              <w:top w:w="100" w:type="dxa"/>
+              <w:left w:w="100" w:type="dxa"/>
+              <w:bottom w:w="100" w:type="dxa"/>
+              <w:right w:w="100" w:type="dxa"/>
+            </w:tcMar>
+            <w:hideMark/>
+          </w:tcPr>
+          <w:p>
+            <w:pPr>
+              <w:spacing w:before="240" w:after="240" w:line="240" w:lineRule="auto"/>
+              <w:jc w:val="both"/>
+              <w:rPr>
+                <w:rFonts w:ascii="Times New Roman" w:eastAsia="Times New Roman" w:hAnsi="Times New Roman" w:cs="Times New Roman"/>
+                <w:kern w:val="0"/>
+                <w:lang w:eastAsia="es-MX"/>
+                <w14:ligatures w14:val="none"/>
+              </w:rPr>
+            </w:pPr>
+            <w:r>
+              <w:rPr>
+                <w:rFonts w:ascii="Times New Roman" w:eastAsia="Times New Roman" w:hAnsi="Times New Roman" w:cs="Times New Roman"/>
+                <w:color w:val="000000"/>
+                <w:kern w:val="0"/>
+                <w:lang w:eastAsia="es-MX"/>
+                <w14:ligatures w14:val="none"/>
+              </w:rPr>
+              <w:t>Top</w:t>
+            </w:r>
+          </w:p>
+        </w:tc>
+        <w:tc>
+          <w:tcPr>
+            <w:tcW w:w="0" w:type="auto"/>
+            <w:tcBorders>
+              <w:top w:val="single" w:sz="4" w:space="0" w:color="000000"/>
+              <w:left w:val="single" w:sz="4" w:space="0" w:color="000000"/>
+              <w:bottom w:val="single" w:sz="4" w:space="0" w:color="000000"/>
+              <w:right w:val="single" w:sz="4" w:space="0" w:color="000000"/>
+            </w:tcBorders>
+            <w:tcMar>
+              <w:top w:w="100" w:type="dxa"/>
+              <w:left w:w="100" w:type="dxa"/>
+              <w:bottom w:w="100" w:type="dxa"/>
+              <w:right w:w="100" w:type="dxa"/>
+            </w:tcMar>
+            <w:hideMark/>
+          </w:tcPr>
+          <w:p>
+            <w:pPr>
+              <w:spacing w:before="240" w:after="240" w:line="240" w:lineRule="auto"/>
+              <w:jc w:val="both"/>
+              <w:rPr>
+                <w:rFonts w:ascii="Times New Roman" w:eastAsia="Times New Roman" w:hAnsi="Times New Roman" w:cs="Times New Roman"/>
+                <w:kern w:val="0"/>
+                <w:lang w:eastAsia="es-MX"/>
+                <w14:ligatures w14:val="none"/>
+              </w:rPr>
+            </w:pPr>
+            <w:r>
+              <w:rPr>
+                <w:rFonts w:ascii="Times New Roman" w:eastAsia="Times New Roman" w:hAnsi="Times New Roman" w:cs="Times New Roman"/>
+                <w:color w:val="000000"/>
+                <w:kern w:val="0"/>
+                <w:lang w:eastAsia="es-MX"/>
+                <w14:ligatures w14:val="none"/>
+              </w:rPr>
+              <w:t>-0.0848</w:t>
+            </w:r>
+          </w:p>
+        </w:tc>
+        <w:tc>
+          <w:tcPr>
+            <w:tcW w:w="0" w:type="auto"/>
+            <w:tcBorders>
+              <w:top w:val="single" w:sz="4" w:space="0" w:color="000000"/>
+              <w:left w:val="single" w:sz="4" w:space="0" w:color="000000"/>
+              <w:bottom w:val="single" w:sz="4" w:space="0" w:color="000000"/>
+              <w:right w:val="single" w:sz="4" w:space="0" w:color="000000"/>
+            </w:tcBorders>
+            <w:tcMar>
+              <w:top w:w="100" w:type="dxa"/>
+              <w:left w:w="100" w:type="dxa"/>
+              <w:bottom w:w="100" w:type="dxa"/>
+              <w:right w:w="100" w:type="dxa"/>
+            </w:tcMar>
+            <w:hideMark/>
+          </w:tcPr>
+          <w:p>
+            <w:pPr>
+              <w:spacing w:before="240" w:after="240" w:line="240" w:lineRule="auto"/>
+              <w:jc w:val="both"/>
+              <w:rPr>
+                <w:rFonts w:ascii="Times New Roman" w:eastAsia="Times New Roman" w:hAnsi="Times New Roman" w:cs="Times New Roman"/>
+                <w:kern w:val="0"/>
+                <w:lang w:eastAsia="es-MX"/>
+                <w14:ligatures w14:val="none"/>
+              </w:rPr>
+            </w:pPr>
+            <w:r>
+              <w:rPr>
+                <w:rFonts w:ascii="Times New Roman" w:eastAsia="Times New Roman" w:hAnsi="Times New Roman" w:cs="Times New Roman"/>
+                <w:color w:val="000000"/>
+                <w:kern w:val="0"/>
+                <w:lang w:eastAsia="es-MX"/>
+                <w14:ligatures w14:val="none"/>
+              </w:rPr>
+              <w:t>Negativo significativo</w:t>
+            </w:r>
+          </w:p>
+        </w:tc>
+      </w:tr>
+      <w:tr>
+        <w:trPr>
+          <w:trHeight w:val="17"/>
+        </w:trPr>
+        <w:tc>
+          <w:tcPr>
+            <w:tcW w:w="0" w:type="auto"/>
+            <w:tcBorders>
+              <w:top w:val="single" w:sz="4" w:space="0" w:color="000000"/>
+              <w:left w:val="single" w:sz="4" w:space="0" w:color="000000"/>
+              <w:bottom w:val="single" w:sz="4" w:space="0" w:color="000000"/>
+              <w:right w:val="single" w:sz="4" w:space="0" w:color="000000"/>
+            </w:tcBorders>
+            <w:tcMar>
+              <w:top w:w="100" w:type="dxa"/>
+              <w:left w:w="100" w:type="dxa"/>
+              <w:bottom w:w="100" w:type="dxa"/>
+              <w:right w:w="100" w:type="dxa"/>
+            </w:tcMar>
+            <w:hideMark/>
+          </w:tcPr>
+          <w:p>
+            <w:pPr>
+              <w:spacing w:before="240" w:after="240" w:line="240" w:lineRule="auto"/>
+              <w:jc w:val="both"/>
+              <w:rPr>
+                <w:rFonts w:ascii="Times New Roman" w:eastAsia="Times New Roman" w:hAnsi="Times New Roman" w:cs="Times New Roman"/>
+                <w:kern w:val="0"/>
+                <w:lang w:eastAsia="es-MX"/>
+                <w14:ligatures w14:val="none"/>
+              </w:rPr>
+            </w:pPr>
+            <w:proofErr w:type="spellStart"/>
+            <w:r>
+              <w:rPr>
+                <w:rFonts w:ascii="Times New Roman" w:eastAsia="Times New Roman" w:hAnsi="Times New Roman" w:cs="Times New Roman"/>
+                <w:color w:val="000000"/>
+                <w:kern w:val="0"/>
+                <w:lang w:eastAsia="es-MX"/>
+                <w14:ligatures w14:val="none"/>
+              </w:rPr>
+              <w:t>Trainers</w:t>
+            </w:r>
+            <w:proofErr w:type="spellEnd"/>
+          </w:p>
+        </w:tc>
+        <w:tc>
+          <w:tcPr>
+            <w:tcW w:w="0" w:type="auto"/>
+            <w:tcBorders>
+              <w:top w:val="single" w:sz="4" w:space="0" w:color="000000"/>
+              <w:left w:val="single" w:sz="4" w:space="0" w:color="000000"/>
+              <w:bottom w:val="single" w:sz="4" w:space="0" w:color="000000"/>
+              <w:right w:val="single" w:sz="4" w:space="0" w:color="000000"/>
+            </w:tcBorders>
+            <w:tcMar>
+              <w:top w:w="100" w:type="dxa"/>
+              <w:left w:w="100" w:type="dxa"/>
+              <w:bottom w:w="100" w:type="dxa"/>
+              <w:right w:w="100" w:type="dxa"/>
+            </w:tcMar>
+            <w:hideMark/>
+          </w:tcPr>
+          <w:p>
+            <w:pPr>
+              <w:spacing w:before="240" w:after="240" w:line="240" w:lineRule="auto"/>
+              <w:jc w:val="both"/>
+              <w:rPr>
+                <w:rFonts w:ascii="Times New Roman" w:eastAsia="Times New Roman" w:hAnsi="Times New Roman" w:cs="Times New Roman"/>
+                <w:kern w:val="0"/>
+                <w:lang w:eastAsia="es-MX"/>
+                <w14:ligatures w14:val="none"/>
+              </w:rPr>
+            </w:pPr>
+            <w:r>
+              <w:rPr>
+                <w:rFonts w:ascii="Times New Roman" w:eastAsia="Times New Roman" w:hAnsi="Times New Roman" w:cs="Times New Roman"/>
+                <w:color w:val="000000"/>
+                <w:kern w:val="0"/>
+                <w:lang w:eastAsia="es-MX"/>
+                <w14:ligatures w14:val="none"/>
+              </w:rPr>
+              <w:t>0.1124</w:t>
+            </w:r>
+          </w:p>
+        </w:tc>
+        <w:tc>
+          <w:tcPr>
+            <w:tcW w:w="0" w:type="auto"/>
+            <w:tcBorders>
+              <w:top w:val="single" w:sz="4" w:space="0" w:color="000000"/>
+              <w:left w:val="single" w:sz="4" w:space="0" w:color="000000"/>
+              <w:bottom w:val="single" w:sz="4" w:space="0" w:color="000000"/>
+              <w:right w:val="single" w:sz="4" w:space="0" w:color="000000"/>
+            </w:tcBorders>
+            <w:tcMar>
+              <w:top w:w="100" w:type="dxa"/>
+              <w:left w:w="100" w:type="dxa"/>
+              <w:bottom w:w="100" w:type="dxa"/>
+              <w:right w:w="100" w:type="dxa"/>
+            </w:tcMar>
+            <w:hideMark/>
+          </w:tcPr>
+          <w:p>
+            <w:pPr>
+              <w:spacing w:before="240" w:after="240" w:line="240" w:lineRule="auto"/>
+              <w:jc w:val="both"/>
+              <w:rPr>
+                <w:rFonts w:ascii="Times New Roman" w:eastAsia="Times New Roman" w:hAnsi="Times New Roman" w:cs="Times New Roman"/>
+                <w:kern w:val="0"/>
+                <w:lang w:eastAsia="es-MX"/>
+                <w14:ligatures w14:val="none"/>
+              </w:rPr>
+            </w:pPr>
+            <w:r>
+              <w:rPr>
+                <w:rFonts w:ascii="Times New Roman" w:eastAsia="Times New Roman" w:hAnsi="Times New Roman" w:cs="Times New Roman"/>
+                <w:color w:val="000000"/>
+                <w:kern w:val="0"/>
+                <w:lang w:eastAsia="es-MX"/>
+                <w14:ligatures w14:val="none"/>
+              </w:rPr>
+              <w:t>Alto impacto positivo</w:t>
+            </w:r>
+          </w:p>
+        </w:tc>
+      </w:tr>
+    </w:tbl>
     <w:p>
       <w:pPr>
         <w:spacing w:before="240" w:after="240" w:line="240" w:lineRule="auto"/>
@@ -2665,8 +3893,319 @@
           <w:lang w:eastAsia="es-MX"/>
           <w14:ligatures w14:val="none"/>
         </w:rPr>
-        <w:t>En términos empresariales, esto significa que el cliente no percibe los aumentos de costos internos, sino únicamente el precio final del producto. Por ello, incrementos de costos no necesariamente generan caídas en ventas, salvo que dichos incrementos sean trasladados al consumidor mediante aumentos de precio.</w:t>
-      </w:r>
+        <w:t>Las categorías de producto muestran diferencias relevantes en comparación con la categoría de referencia del modelo</w:t>
+      </w:r>
+      <w:r>
+        <w:rPr>
+          <w:rFonts w:ascii="Times New Roman" w:eastAsia="Times New Roman" w:hAnsi="Times New Roman" w:cs="Times New Roman"/>
+          <w:i/>
+          <w:iCs/>
+          <w:color w:val="000000"/>
+          <w:kern w:val="0"/>
+          <w:lang w:eastAsia="es-MX"/>
+          <w14:ligatures w14:val="none"/>
+        </w:rPr>
+        <w:t xml:space="preserve"> (Tabla 1)</w:t>
+      </w:r>
+    </w:p>
+    <w:p>
+      <w:pPr>
+        <w:numPr>
+          <w:ilvl w:val="0"/>
+          <w:numId w:val="6"/>
+        </w:numPr>
+        <w:spacing w:before="240" w:after="0" w:line="240" w:lineRule="auto"/>
+        <w:jc w:val="both"/>
+        <w:textAlignment w:val="baseline"/>
+        <w:rPr>
+          <w:rFonts w:ascii="Times New Roman" w:eastAsia="Times New Roman" w:hAnsi="Times New Roman" w:cs="Times New Roman"/>
+          <w:color w:val="000000"/>
+          <w:kern w:val="0"/>
+          <w:lang w:eastAsia="es-MX"/>
+          <w14:ligatures w14:val="none"/>
+        </w:rPr>
+      </w:pPr>
+      <w:proofErr w:type="spellStart"/>
+      <w:r>
+        <w:rPr>
+          <w:rFonts w:ascii="Times New Roman" w:eastAsia="Times New Roman" w:hAnsi="Times New Roman" w:cs="Times New Roman"/>
+          <w:b/>
+          <w:bCs/>
+          <w:color w:val="000000"/>
+          <w:kern w:val="0"/>
+          <w:lang w:eastAsia="es-MX"/>
+          <w14:ligatures w14:val="none"/>
+        </w:rPr>
+        <w:t>Jacket</w:t>
+      </w:r>
+      <w:proofErr w:type="spellEnd"/>
+      <w:r>
+        <w:rPr>
+          <w:rFonts w:ascii="Times New Roman" w:eastAsia="Times New Roman" w:hAnsi="Times New Roman" w:cs="Times New Roman"/>
+          <w:color w:val="000000"/>
+          <w:kern w:val="0"/>
+          <w:lang w:eastAsia="es-MX"/>
+          <w14:ligatures w14:val="none"/>
+        </w:rPr>
+        <w:t xml:space="preserve"> presentó un coeficiente de 0.0704 y un p-valor de 0.0029, siendo estadísticamente significativo al 1% (**). Esto implica que, manteniendo constantes las demás variables, las chaquetas registran mayores ventas relativas frente a la categoría base.</w:t>
+      </w:r>
+    </w:p>
+    <w:p>
+      <w:pPr>
+        <w:numPr>
+          <w:ilvl w:val="0"/>
+          <w:numId w:val="6"/>
+        </w:numPr>
+        <w:spacing w:after="0" w:line="240" w:lineRule="auto"/>
+        <w:jc w:val="both"/>
+        <w:textAlignment w:val="baseline"/>
+        <w:rPr>
+          <w:rFonts w:ascii="Times New Roman" w:eastAsia="Times New Roman" w:hAnsi="Times New Roman" w:cs="Times New Roman"/>
+          <w:color w:val="000000"/>
+          <w:kern w:val="0"/>
+          <w:lang w:eastAsia="es-MX"/>
+          <w14:ligatures w14:val="none"/>
+        </w:rPr>
+      </w:pPr>
+      <w:r>
+        <w:rPr>
+          <w:rFonts w:ascii="Times New Roman" w:eastAsia="Times New Roman" w:hAnsi="Times New Roman" w:cs="Times New Roman"/>
+          <w:b/>
+          <w:bCs/>
+          <w:color w:val="000000"/>
+          <w:kern w:val="0"/>
+          <w:lang w:eastAsia="es-MX"/>
+          <w14:ligatures w14:val="none"/>
+        </w:rPr>
+        <w:t>Jeans</w:t>
+      </w:r>
+      <w:r>
+        <w:rPr>
+          <w:rFonts w:ascii="Times New Roman" w:eastAsia="Times New Roman" w:hAnsi="Times New Roman" w:cs="Times New Roman"/>
+          <w:color w:val="000000"/>
+          <w:kern w:val="0"/>
+          <w:lang w:eastAsia="es-MX"/>
+          <w14:ligatures w14:val="none"/>
+        </w:rPr>
+        <w:t xml:space="preserve"> obtuvo un coeficiente de 0.0440 con p = 0.0548. El efecto es positivo, pero solo marginalmente significativo al 10%, por lo que la evidencia estadística es más débil.</w:t>
+      </w:r>
+    </w:p>
+    <w:p>
+      <w:pPr>
+        <w:numPr>
+          <w:ilvl w:val="0"/>
+          <w:numId w:val="6"/>
+        </w:numPr>
+        <w:spacing w:after="0" w:line="240" w:lineRule="auto"/>
+        <w:jc w:val="both"/>
+        <w:textAlignment w:val="baseline"/>
+        <w:rPr>
+          <w:rFonts w:ascii="Times New Roman" w:eastAsia="Times New Roman" w:hAnsi="Times New Roman" w:cs="Times New Roman"/>
+          <w:color w:val="000000"/>
+          <w:kern w:val="0"/>
+          <w:lang w:eastAsia="es-MX"/>
+          <w14:ligatures w14:val="none"/>
+        </w:rPr>
+      </w:pPr>
+      <w:proofErr w:type="spellStart"/>
+      <w:r>
+        <w:rPr>
+          <w:rFonts w:ascii="Times New Roman" w:eastAsia="Times New Roman" w:hAnsi="Times New Roman" w:cs="Times New Roman"/>
+          <w:b/>
+          <w:bCs/>
+          <w:color w:val="000000"/>
+          <w:kern w:val="0"/>
+          <w:lang w:eastAsia="es-MX"/>
+          <w14:ligatures w14:val="none"/>
+        </w:rPr>
+        <w:t>Shoes</w:t>
+      </w:r>
+      <w:proofErr w:type="spellEnd"/>
+      <w:r>
+        <w:rPr>
+          <w:rFonts w:ascii="Times New Roman" w:eastAsia="Times New Roman" w:hAnsi="Times New Roman" w:cs="Times New Roman"/>
+          <w:color w:val="000000"/>
+          <w:kern w:val="0"/>
+          <w:lang w:eastAsia="es-MX"/>
+          <w14:ligatures w14:val="none"/>
+        </w:rPr>
+        <w:t xml:space="preserve"> presentó un coeficiente positivo de 0.1132 y significativo, indicando un desempeño comercial superior respecto a la categoría base.</w:t>
+      </w:r>
+    </w:p>
+    <w:p>
+      <w:pPr>
+        <w:numPr>
+          <w:ilvl w:val="0"/>
+          <w:numId w:val="6"/>
+        </w:numPr>
+        <w:spacing w:after="0" w:line="240" w:lineRule="auto"/>
+        <w:jc w:val="both"/>
+        <w:textAlignment w:val="baseline"/>
+        <w:rPr>
+          <w:rFonts w:ascii="Times New Roman" w:eastAsia="Times New Roman" w:hAnsi="Times New Roman" w:cs="Times New Roman"/>
+          <w:color w:val="000000"/>
+          <w:kern w:val="0"/>
+          <w:lang w:eastAsia="es-MX"/>
+          <w14:ligatures w14:val="none"/>
+        </w:rPr>
+      </w:pPr>
+      <w:r>
+        <w:rPr>
+          <w:rFonts w:ascii="Times New Roman" w:eastAsia="Times New Roman" w:hAnsi="Times New Roman" w:cs="Times New Roman"/>
+          <w:b/>
+          <w:bCs/>
+          <w:color w:val="000000"/>
+          <w:kern w:val="0"/>
+          <w:lang w:eastAsia="es-MX"/>
+          <w14:ligatures w14:val="none"/>
+        </w:rPr>
+        <w:t>T-</w:t>
+      </w:r>
+      <w:proofErr w:type="spellStart"/>
+      <w:r>
+        <w:rPr>
+          <w:rFonts w:ascii="Times New Roman" w:eastAsia="Times New Roman" w:hAnsi="Times New Roman" w:cs="Times New Roman"/>
+          <w:b/>
+          <w:bCs/>
+          <w:color w:val="000000"/>
+          <w:kern w:val="0"/>
+          <w:lang w:eastAsia="es-MX"/>
+          <w14:ligatures w14:val="none"/>
+        </w:rPr>
+        <w:t>shirt</w:t>
+      </w:r>
+      <w:proofErr w:type="spellEnd"/>
+      <w:r>
+        <w:rPr>
+          <w:rFonts w:ascii="Times New Roman" w:eastAsia="Times New Roman" w:hAnsi="Times New Roman" w:cs="Times New Roman"/>
+          <w:color w:val="000000"/>
+          <w:kern w:val="0"/>
+          <w:lang w:eastAsia="es-MX"/>
+          <w14:ligatures w14:val="none"/>
+        </w:rPr>
+        <w:t xml:space="preserve"> registró un coeficiente negativo de -0.0385, mientras que Top presentó un efecto de -0.0848. Ambos resultados sugieren menores niveles de ventas relativas.</w:t>
+      </w:r>
+    </w:p>
+    <w:p>
+      <w:pPr>
+        <w:numPr>
+          <w:ilvl w:val="0"/>
+          <w:numId w:val="6"/>
+        </w:numPr>
+        <w:spacing w:after="240" w:line="240" w:lineRule="auto"/>
+        <w:jc w:val="both"/>
+        <w:textAlignment w:val="baseline"/>
+        <w:rPr>
+          <w:rFonts w:ascii="Times New Roman" w:eastAsia="Times New Roman" w:hAnsi="Times New Roman" w:cs="Times New Roman"/>
+          <w:color w:val="000000"/>
+          <w:kern w:val="0"/>
+          <w:lang w:eastAsia="es-MX"/>
+          <w14:ligatures w14:val="none"/>
+        </w:rPr>
+      </w:pPr>
+      <w:proofErr w:type="spellStart"/>
+      <w:r>
+        <w:rPr>
+          <w:rFonts w:ascii="Times New Roman" w:eastAsia="Times New Roman" w:hAnsi="Times New Roman" w:cs="Times New Roman"/>
+          <w:b/>
+          <w:bCs/>
+          <w:color w:val="000000"/>
+          <w:kern w:val="0"/>
+          <w:lang w:eastAsia="es-MX"/>
+          <w14:ligatures w14:val="none"/>
+        </w:rPr>
+        <w:t>Trainers</w:t>
+      </w:r>
+      <w:proofErr w:type="spellEnd"/>
+      <w:r>
+        <w:rPr>
+          <w:rFonts w:ascii="Times New Roman" w:eastAsia="Times New Roman" w:hAnsi="Times New Roman" w:cs="Times New Roman"/>
+          <w:b/>
+          <w:bCs/>
+          <w:color w:val="000000"/>
+          <w:kern w:val="0"/>
+          <w:lang w:eastAsia="es-MX"/>
+          <w14:ligatures w14:val="none"/>
+        </w:rPr>
+        <w:t xml:space="preserve"> </w:t>
+      </w:r>
+      <w:r>
+        <w:rPr>
+          <w:rFonts w:ascii="Times New Roman" w:eastAsia="Times New Roman" w:hAnsi="Times New Roman" w:cs="Times New Roman"/>
+          <w:color w:val="000000"/>
+          <w:kern w:val="0"/>
+          <w:lang w:eastAsia="es-MX"/>
+          <w14:ligatures w14:val="none"/>
+        </w:rPr>
+        <w:t>obtuvo un coeficiente de 0.1124, evidenciando un efecto positivo sobre las ventas.</w:t>
+      </w:r>
+    </w:p>
+    <w:p>
+      <w:pPr>
+        <w:spacing w:before="240" w:after="240" w:line="240" w:lineRule="auto"/>
+        <w:jc w:val="both"/>
+        <w:rPr>
+          <w:rFonts w:ascii="Times New Roman" w:eastAsia="Times New Roman" w:hAnsi="Times New Roman" w:cs="Times New Roman"/>
+          <w:kern w:val="0"/>
+          <w:lang w:eastAsia="es-MX"/>
+          <w14:ligatures w14:val="none"/>
+        </w:rPr>
+      </w:pPr>
+      <w:r>
+        <w:rPr>
+          <w:rFonts w:ascii="Times New Roman" w:eastAsia="Times New Roman" w:hAnsi="Times New Roman" w:cs="Times New Roman"/>
+          <w:color w:val="000000"/>
+          <w:kern w:val="0"/>
+          <w:lang w:eastAsia="es-MX"/>
+          <w14:ligatures w14:val="none"/>
+        </w:rPr>
+        <w:t xml:space="preserve">En conjunto, los resultados muestran que la sensibilidad de la demanda varía significativamente entre líneas de producto, lo cual respalda la necesidad de implementar estrategias de </w:t>
+      </w:r>
+      <w:proofErr w:type="spellStart"/>
+      <w:r>
+        <w:rPr>
+          <w:rFonts w:ascii="Times New Roman" w:eastAsia="Times New Roman" w:hAnsi="Times New Roman" w:cs="Times New Roman"/>
+          <w:color w:val="000000"/>
+          <w:kern w:val="0"/>
+          <w:lang w:eastAsia="es-MX"/>
+          <w14:ligatures w14:val="none"/>
+        </w:rPr>
+        <w:t>pricing</w:t>
+      </w:r>
+      <w:proofErr w:type="spellEnd"/>
+      <w:r>
+        <w:rPr>
+          <w:rFonts w:ascii="Times New Roman" w:eastAsia="Times New Roman" w:hAnsi="Times New Roman" w:cs="Times New Roman"/>
+          <w:color w:val="000000"/>
+          <w:kern w:val="0"/>
+          <w:lang w:eastAsia="es-MX"/>
+          <w14:ligatures w14:val="none"/>
+        </w:rPr>
+        <w:t xml:space="preserve"> diferenciadas por categoría.</w:t>
+      </w:r>
+    </w:p>
+    <w:p>
+      <w:pPr>
+        <w:spacing w:after="0" w:line="240" w:lineRule="auto"/>
+        <w:rPr>
+          <w:rFonts w:ascii="Times New Roman" w:eastAsia="Times New Roman" w:hAnsi="Times New Roman" w:cs="Times New Roman"/>
+          <w:kern w:val="0"/>
+          <w:lang w:eastAsia="es-MX"/>
+          <w14:ligatures w14:val="none"/>
+        </w:rPr>
+      </w:pPr>
+    </w:p>
+    <w:p>
+      <w:pPr>
+        <w:spacing w:before="240" w:after="240" w:line="240" w:lineRule="auto"/>
+        <w:jc w:val="both"/>
+        <w:rPr>
+          <w:rFonts w:ascii="Times New Roman" w:eastAsia="Times New Roman" w:hAnsi="Times New Roman" w:cs="Times New Roman"/>
+          <w:kern w:val="0"/>
+          <w:lang w:eastAsia="es-MX"/>
+          <w14:ligatures w14:val="none"/>
+        </w:rPr>
+      </w:pPr>
     </w:p>
     <w:p>
       <w:pPr>
@@ -2727,122 +4266,9 @@
 <file path=word/numbering.xml><?xml version="1.0" encoding="utf-8"?>
 <w:numbering xmlns:wpc="http://schemas.microsoft.com/office/word/2010/wordprocessingCanvas" xmlns:cx="http://schemas.microsoft.com/office/drawing/2014/chartex" xmlns:cx1="http://schemas.microsoft.com/office/drawing/2015/9/8/chartex" xmlns:cx2="http://schemas.microsoft.com/office/drawing/2015/10/21/chartex" xmlns:cx3="http://schemas.microsoft.com/office/drawing/2016/5/9/chartex" xmlns:cx4="http://schemas.microsoft.com/office/drawing/2016/5/10/chartex" xmlns:cx5="http://schemas.microsoft.com/office/drawing/2016/5/11/chartex" xmlns:cx6="http://schemas.microsoft.com/office/drawing/2016/5/12/chartex" xmlns:cx7="http://schemas.microsoft.com/office/drawing/2016/5/13/chartex" xmlns:cx8="http://schemas.microsoft.com/office/drawing/2016/5/14/chartex" xmlns:mc="http://schemas.openxmlformats.org/markup-compatibility/2006" xmlns:aink="http://schemas.microsoft.com/office/drawing/2016/ink" xmlns:am3d="http://schemas.microsoft.com/office/drawing/2017/model3d" xmlns:o="urn:schemas-microsoft-com:office:office" xmlns:oel="http://schemas.microsoft.com/office/2019/extlst" xmlns:r="http://schemas.openxmlformats.org/officeDocument/2006/relationships" xmlns:m="http://schemas.openxmlformats.org/officeDocument/2006/math" xmlns:v="urn:schemas-microsoft-com:vml" xmlns:wp14="http://schemas.microsoft.com/office/word/2010/wordprocessingDrawing" xmlns:wp="http://schemas.openxmlformats.org/drawingml/2006/wordprocessingDrawing" xmlns:w10="urn:schemas-microsoft-com:office:word" xmlns:w="http://schemas.openxmlformats.org/wordprocessingml/2006/main" xmlns:w14="http://schemas.microsoft.com/office/word/2010/wordml" xmlns:w15="http://schemas.microsoft.com/office/word/2012/wordml" xmlns:w16cex="http://schemas.microsoft.com/office/word/2018/wordml/cex" xmlns:w16cid="http://schemas.microsoft.com/office/word/2016/wordml/cid" xmlns:w16="http://schemas.microsoft.com/office/word/2018/wordml" xmlns:w16du="http://schemas.microsoft.com/office/word/2023/wordml/word16du" xmlns:w16sdtdh="http://schemas.microsoft.com/office/word/2020/wordml/sdtdatahash" xmlns:w16sdtfl="http://schemas.microsoft.com/office/word/2024/wordml/sdtformatlock" xmlns:w16se="http://schemas.microsoft.com/office/word/2015/wordml/symex" xmlns:wpg="http://schemas.microsoft.com/office/word/2010/wordprocessingGroup" xmlns:wpi="http://schemas.microsoft.com/office/word/2010/wordprocessingInk" xmlns:wne="http://schemas.microsoft.com/office/word/2006/wordml" xmlns:wps="http://schemas.microsoft.com/office/word/2010/wordprocessingShape" mc:Ignorable="w14 w15 w16se w16cid w16 w16cex w16sdtdh w16sdtfl w16du wp14">
   <w:abstractNum w:abstractNumId="0" w15:restartNumberingAfterBreak="0">
-    <w:nsid w:val="2D51481D"/>
+    <w:nsid w:val="0D6514A4"/>
     <w:multiLevelType w:val="multilevel"/>
-    <w:tmpl w:val="9B964B42"/>
-    <w:lvl w:ilvl="0">
-      <w:start w:val="1"/>
-      <w:numFmt w:val="decimal"/>
-      <w:lvlText w:val="%1."/>
-      <w:lvlJc w:val="left"/>
-      <w:pPr>
-        <w:tabs>
-          <w:tab w:val="num" w:pos="720"/>
-        </w:tabs>
-        <w:ind w:left="720" w:hanging="360"/>
-      </w:pPr>
-    </w:lvl>
-    <w:lvl w:ilvl="1" w:tentative="1">
-      <w:start w:val="1"/>
-      <w:numFmt w:val="decimal"/>
-      <w:lvlText w:val="%2."/>
-      <w:lvlJc w:val="left"/>
-      <w:pPr>
-        <w:tabs>
-          <w:tab w:val="num" w:pos="1440"/>
-        </w:tabs>
-        <w:ind w:left="1440" w:hanging="360"/>
-      </w:pPr>
-    </w:lvl>
-    <w:lvl w:ilvl="2" w:tentative="1">
-      <w:start w:val="1"/>
-      <w:numFmt w:val="decimal"/>
-      <w:lvlText w:val="%3."/>
-      <w:lvlJc w:val="left"/>
-      <w:pPr>
-        <w:tabs>
-          <w:tab w:val="num" w:pos="2160"/>
-        </w:tabs>
-        <w:ind w:left="2160" w:hanging="360"/>
-      </w:pPr>
-    </w:lvl>
-    <w:lvl w:ilvl="3" w:tentative="1">
-      <w:start w:val="1"/>
-      <w:numFmt w:val="decimal"/>
-      <w:lvlText w:val="%4."/>
-      <w:lvlJc w:val="left"/>
-      <w:pPr>
-        <w:tabs>
-          <w:tab w:val="num" w:pos="2880"/>
-        </w:tabs>
-        <w:ind w:left="2880" w:hanging="360"/>
-      </w:pPr>
-    </w:lvl>
-    <w:lvl w:ilvl="4" w:tentative="1">
-      <w:start w:val="1"/>
-      <w:numFmt w:val="decimal"/>
-      <w:lvlText w:val="%5."/>
-      <w:lvlJc w:val="left"/>
-      <w:pPr>
-        <w:tabs>
-          <w:tab w:val="num" w:pos="3600"/>
-        </w:tabs>
-        <w:ind w:left="3600" w:hanging="360"/>
-      </w:pPr>
-    </w:lvl>
-    <w:lvl w:ilvl="5" w:tentative="1">
-      <w:start w:val="1"/>
-      <w:numFmt w:val="decimal"/>
-      <w:lvlText w:val="%6."/>
-      <w:lvlJc w:val="left"/>
-      <w:pPr>
-        <w:tabs>
-          <w:tab w:val="num" w:pos="4320"/>
-        </w:tabs>
-        <w:ind w:left="4320" w:hanging="360"/>
-      </w:pPr>
-    </w:lvl>
-    <w:lvl w:ilvl="6" w:tentative="1">
-      <w:start w:val="1"/>
-      <w:numFmt w:val="decimal"/>
-      <w:lvlText w:val="%7."/>
-      <w:lvlJc w:val="left"/>
-      <w:pPr>
-        <w:tabs>
-          <w:tab w:val="num" w:pos="5040"/>
-        </w:tabs>
-        <w:ind w:left="5040" w:hanging="360"/>
-      </w:pPr>
-    </w:lvl>
-    <w:lvl w:ilvl="7" w:tentative="1">
-      <w:start w:val="1"/>
-      <w:numFmt w:val="decimal"/>
-      <w:lvlText w:val="%8."/>
-      <w:lvlJc w:val="left"/>
-      <w:pPr>
-        <w:tabs>
-          <w:tab w:val="num" w:pos="5760"/>
-        </w:tabs>
-        <w:ind w:left="5760" w:hanging="360"/>
-      </w:pPr>
-    </w:lvl>
-    <w:lvl w:ilvl="8" w:tentative="1">
-      <w:start w:val="1"/>
-      <w:numFmt w:val="decimal"/>
-      <w:lvlText w:val="%9."/>
-      <w:lvlJc w:val="left"/>
-      <w:pPr>
-        <w:tabs>
-          <w:tab w:val="num" w:pos="6480"/>
-        </w:tabs>
-        <w:ind w:left="6480" w:hanging="360"/>
-      </w:pPr>
-    </w:lvl>
-  </w:abstractNum>
-  <w:abstractNum w:abstractNumId="1" w15:restartNumberingAfterBreak="0">
-    <w:nsid w:val="32546F64"/>
-    <w:multiLevelType w:val="multilevel"/>
-    <w:tmpl w:val="3D9AA8FA"/>
+    <w:tmpl w:val="038447FE"/>
     <w:lvl w:ilvl="0">
       <w:start w:val="1"/>
       <w:numFmt w:val="bullet"/>
@@ -2988,10 +4414,123 @@
       </w:rPr>
     </w:lvl>
   </w:abstractNum>
+  <w:abstractNum w:abstractNumId="1" w15:restartNumberingAfterBreak="0">
+    <w:nsid w:val="2D51481D"/>
+    <w:multiLevelType w:val="multilevel"/>
+    <w:tmpl w:val="9B964B42"/>
+    <w:lvl w:ilvl="0">
+      <w:start w:val="1"/>
+      <w:numFmt w:val="decimal"/>
+      <w:lvlText w:val="%1."/>
+      <w:lvlJc w:val="left"/>
+      <w:pPr>
+        <w:tabs>
+          <w:tab w:val="num" w:pos="720"/>
+        </w:tabs>
+        <w:ind w:left="720" w:hanging="360"/>
+      </w:pPr>
+    </w:lvl>
+    <w:lvl w:ilvl="1" w:tentative="1">
+      <w:start w:val="1"/>
+      <w:numFmt w:val="decimal"/>
+      <w:lvlText w:val="%2."/>
+      <w:lvlJc w:val="left"/>
+      <w:pPr>
+        <w:tabs>
+          <w:tab w:val="num" w:pos="1440"/>
+        </w:tabs>
+        <w:ind w:left="1440" w:hanging="360"/>
+      </w:pPr>
+    </w:lvl>
+    <w:lvl w:ilvl="2" w:tentative="1">
+      <w:start w:val="1"/>
+      <w:numFmt w:val="decimal"/>
+      <w:lvlText w:val="%3."/>
+      <w:lvlJc w:val="left"/>
+      <w:pPr>
+        <w:tabs>
+          <w:tab w:val="num" w:pos="2160"/>
+        </w:tabs>
+        <w:ind w:left="2160" w:hanging="360"/>
+      </w:pPr>
+    </w:lvl>
+    <w:lvl w:ilvl="3" w:tentative="1">
+      <w:start w:val="1"/>
+      <w:numFmt w:val="decimal"/>
+      <w:lvlText w:val="%4."/>
+      <w:lvlJc w:val="left"/>
+      <w:pPr>
+        <w:tabs>
+          <w:tab w:val="num" w:pos="2880"/>
+        </w:tabs>
+        <w:ind w:left="2880" w:hanging="360"/>
+      </w:pPr>
+    </w:lvl>
+    <w:lvl w:ilvl="4" w:tentative="1">
+      <w:start w:val="1"/>
+      <w:numFmt w:val="decimal"/>
+      <w:lvlText w:val="%5."/>
+      <w:lvlJc w:val="left"/>
+      <w:pPr>
+        <w:tabs>
+          <w:tab w:val="num" w:pos="3600"/>
+        </w:tabs>
+        <w:ind w:left="3600" w:hanging="360"/>
+      </w:pPr>
+    </w:lvl>
+    <w:lvl w:ilvl="5" w:tentative="1">
+      <w:start w:val="1"/>
+      <w:numFmt w:val="decimal"/>
+      <w:lvlText w:val="%6."/>
+      <w:lvlJc w:val="left"/>
+      <w:pPr>
+        <w:tabs>
+          <w:tab w:val="num" w:pos="4320"/>
+        </w:tabs>
+        <w:ind w:left="4320" w:hanging="360"/>
+      </w:pPr>
+    </w:lvl>
+    <w:lvl w:ilvl="6" w:tentative="1">
+      <w:start w:val="1"/>
+      <w:numFmt w:val="decimal"/>
+      <w:lvlText w:val="%7."/>
+      <w:lvlJc w:val="left"/>
+      <w:pPr>
+        <w:tabs>
+          <w:tab w:val="num" w:pos="5040"/>
+        </w:tabs>
+        <w:ind w:left="5040" w:hanging="360"/>
+      </w:pPr>
+    </w:lvl>
+    <w:lvl w:ilvl="7" w:tentative="1">
+      <w:start w:val="1"/>
+      <w:numFmt w:val="decimal"/>
+      <w:lvlText w:val="%8."/>
+      <w:lvlJc w:val="left"/>
+      <w:pPr>
+        <w:tabs>
+          <w:tab w:val="num" w:pos="5760"/>
+        </w:tabs>
+        <w:ind w:left="5760" w:hanging="360"/>
+      </w:pPr>
+    </w:lvl>
+    <w:lvl w:ilvl="8" w:tentative="1">
+      <w:start w:val="1"/>
+      <w:numFmt w:val="decimal"/>
+      <w:lvlText w:val="%9."/>
+      <w:lvlJc w:val="left"/>
+      <w:pPr>
+        <w:tabs>
+          <w:tab w:val="num" w:pos="6480"/>
+        </w:tabs>
+        <w:ind w:left="6480" w:hanging="360"/>
+      </w:pPr>
+    </w:lvl>
+  </w:abstractNum>
   <w:abstractNum w:abstractNumId="2" w15:restartNumberingAfterBreak="0">
-    <w:nsid w:val="49005556"/>
+    <w:nsid w:val="32546F64"/>
     <w:multiLevelType w:val="multilevel"/>
-    <w:tmpl w:val="298C6E88"/>
+    <w:tmpl w:val="3D9AA8FA"/>
     <w:lvl w:ilvl="0">
       <w:start w:val="1"/>
       <w:numFmt w:val="bullet"/>
@@ -3138,9 +4677,9 @@
     </w:lvl>
   </w:abstractNum>
   <w:abstractNum w:abstractNumId="3" w15:restartNumberingAfterBreak="0">
-    <w:nsid w:val="600C694E"/>
+    <w:nsid w:val="49005556"/>
     <w:multiLevelType w:val="multilevel"/>
-    <w:tmpl w:val="345C3B72"/>
+    <w:tmpl w:val="298C6E88"/>
     <w:lvl w:ilvl="0">
       <w:start w:val="1"/>
       <w:numFmt w:val="bullet"/>
@@ -3287,9 +4826,9 @@
     </w:lvl>
   </w:abstractNum>
   <w:abstractNum w:abstractNumId="4" w15:restartNumberingAfterBreak="0">
-    <w:nsid w:val="67240A34"/>
+    <w:nsid w:val="600C694E"/>
     <w:multiLevelType w:val="multilevel"/>
-    <w:tmpl w:val="348C4E22"/>
+    <w:tmpl w:val="345C3B72"/>
     <w:lvl w:ilvl="0">
       <w:start w:val="1"/>
       <w:numFmt w:val="bullet"/>
@@ -3435,20 +4974,172 @@
       </w:rPr>
     </w:lvl>
   </w:abstractNum>
+  <w:abstractNum w:abstractNumId="5" w15:restartNumberingAfterBreak="0">
+    <w:nsid w:val="67240A34"/>
+    <w:multiLevelType w:val="multilevel"/>
+    <w:tmpl w:val="348C4E22"/>
+    <w:lvl w:ilvl="0">
+      <w:start w:val="1"/>
+      <w:numFmt w:val="bullet"/>
+      <w:lvlText w:val=""/>
+      <w:lvlJc w:val="left"/>
+      <w:pPr>
+        <w:tabs>
+          <w:tab w:val="num" w:pos="720"/>
+        </w:tabs>
+        <w:ind w:left="720" w:hanging="360"/>
+      </w:pPr>
+      <w:rPr>
+        <w:rFonts w:ascii="Symbol" w:hAnsi="Symbol" w:hint="default"/>
+        <w:sz w:val="20"/>
+      </w:rPr>
+    </w:lvl>
+    <w:lvl w:ilvl="1" w:tentative="1">
+      <w:start w:val="1"/>
+      <w:numFmt w:val="bullet"/>
+      <w:lvlText w:val="o"/>
+      <w:lvlJc w:val="left"/>
+      <w:pPr>
+        <w:tabs>
+          <w:tab w:val="num" w:pos="1440"/>
+        </w:tabs>
+        <w:ind w:left="1440" w:hanging="360"/>
+      </w:pPr>
+      <w:rPr>
+        <w:rFonts w:ascii="Courier New" w:hAnsi="Courier New" w:hint="default"/>
+        <w:sz w:val="20"/>
+      </w:rPr>
+    </w:lvl>
+    <w:lvl w:ilvl="2" w:tentative="1">
+      <w:start w:val="1"/>
+      <w:numFmt w:val="bullet"/>
+      <w:lvlText w:val=""/>
+      <w:lvlJc w:val="left"/>
+      <w:pPr>
+        <w:tabs>
+          <w:tab w:val="num" w:pos="2160"/>
+        </w:tabs>
+        <w:ind w:left="2160" w:hanging="360"/>
+      </w:pPr>
+      <w:rPr>
+        <w:rFonts w:ascii="Wingdings" w:hAnsi="Wingdings" w:hint="default"/>
+        <w:sz w:val="20"/>
+      </w:rPr>
+    </w:lvl>
+    <w:lvl w:ilvl="3" w:tentative="1">
+      <w:start w:val="1"/>
+      <w:numFmt w:val="bullet"/>
+      <w:lvlText w:val=""/>
+      <w:lvlJc w:val="left"/>
+      <w:pPr>
+        <w:tabs>
+          <w:tab w:val="num" w:pos="2880"/>
+        </w:tabs>
+        <w:ind w:left="2880" w:hanging="360"/>
+      </w:pPr>
+      <w:rPr>
+        <w:rFonts w:ascii="Wingdings" w:hAnsi="Wingdings" w:hint="default"/>
+        <w:sz w:val="20"/>
+      </w:rPr>
+    </w:lvl>
+    <w:lvl w:ilvl="4" w:tentative="1">
+      <w:start w:val="1"/>
+      <w:numFmt w:val="bullet"/>
+      <w:lvlText w:val=""/>
+      <w:lvlJc w:val="left"/>
+      <w:pPr>
+        <w:tabs>
+          <w:tab w:val="num" w:pos="3600"/>
+        </w:tabs>
+        <w:ind w:left="3600" w:hanging="360"/>
+      </w:pPr>
+      <w:rPr>
+        <w:rFonts w:ascii="Wingdings" w:hAnsi="Wingdings" w:hint="default"/>
+        <w:sz w:val="20"/>
+      </w:rPr>
+    </w:lvl>
+    <w:lvl w:ilvl="5" w:tentative="1">
+      <w:start w:val="1"/>
+      <w:numFmt w:val="bullet"/>
+      <w:lvlText w:val=""/>
+      <w:lvlJc w:val="left"/>
+      <w:pPr>
+        <w:tabs>
+          <w:tab w:val="num" w:pos="4320"/>
+        </w:tabs>
+        <w:ind w:left="4320" w:hanging="360"/>
+      </w:pPr>
+      <w:rPr>
+        <w:rFonts w:ascii="Wingdings" w:hAnsi="Wingdings" w:hint="default"/>
+        <w:sz w:val="20"/>
+      </w:rPr>
+    </w:lvl>
+    <w:lvl w:ilvl="6" w:tentative="1">
+      <w:start w:val="1"/>
+      <w:numFmt w:val="bullet"/>
+      <w:lvlText w:val=""/>
+      <w:lvlJc w:val="left"/>
+      <w:pPr>
+        <w:tabs>
+          <w:tab w:val="num" w:pos="5040"/>
+        </w:tabs>
+        <w:ind w:left="5040" w:hanging="360"/>
+      </w:pPr>
+      <w:rPr>
+        <w:rFonts w:ascii="Wingdings" w:hAnsi="Wingdings" w:hint="default"/>
+        <w:sz w:val="20"/>
+      </w:rPr>
+    </w:lvl>
+    <w:lvl w:ilvl="7" w:tentative="1">
+      <w:start w:val="1"/>
+      <w:numFmt w:val="bullet"/>
+      <w:lvlText w:val=""/>
+      <w:lvlJc w:val="left"/>
+      <w:pPr>
+        <w:tabs>
+          <w:tab w:val="num" w:pos="5760"/>
+        </w:tabs>
+        <w:ind w:left="5760" w:hanging="360"/>
+      </w:pPr>
+      <w:rPr>
+        <w:rFonts w:ascii="Wingdings" w:hAnsi="Wingdings" w:hint="default"/>
+        <w:sz w:val="20"/>
+      </w:rPr>
+    </w:lvl>
+    <w:lvl w:ilvl="8" w:tentative="1">
+      <w:start w:val="1"/>
+      <w:numFmt w:val="bullet"/>
+      <w:lvlText w:val=""/>
+      <w:lvlJc w:val="left"/>
+      <w:pPr>
+        <w:tabs>
+          <w:tab w:val="num" w:pos="6480"/>
+        </w:tabs>
+        <w:ind w:left="6480" w:hanging="360"/>
+      </w:pPr>
+      <w:rPr>
+        <w:rFonts w:ascii="Wingdings" w:hAnsi="Wingdings" w:hint="default"/>
+        <w:sz w:val="20"/>
+      </w:rPr>
+    </w:lvl>
+  </w:abstractNum>
   <w:num w:numId="1" w16cid:durableId="363023352">
+    <w:abstractNumId w:val="2"/>
+  </w:num>
+  <w:num w:numId="2" w16cid:durableId="951858285">
     <w:abstractNumId w:val="1"/>
   </w:num>
-  <w:num w:numId="2" w16cid:durableId="951858285">
-    <w:abstractNumId w:val="0"/>
+  <w:num w:numId="3" w16cid:durableId="2091005357">
+    <w:abstractNumId w:val="5"/>
   </w:num>
-  <w:num w:numId="3" w16cid:durableId="2091005357">
+  <w:num w:numId="4" w16cid:durableId="196509368">
     <w:abstractNumId w:val="4"/>
   </w:num>
-  <w:num w:numId="4" w16cid:durableId="196509368">
+  <w:num w:numId="5" w16cid:durableId="1762025039">
     <w:abstractNumId w:val="3"/>
   </w:num>
-  <w:num w:numId="5" w16cid:durableId="1762025039">
-    <w:abstractNumId w:val="2"/>
+  <w:num w:numId="6" w16cid:durableId="668368146">
+    <w:abstractNumId w:val="0"/>
   </w:num>
 </w:numbering>
 </file>

</xml_diff>

<commit_message>
Corrección tabla resumen estadístico
Corregí la tabal de reusmen estadístico dentro del doc
</commit_message>
<xml_diff>
--- a/Proyecto final Analítica.docx
+++ b/Proyecto final Analítica.docx
@@ -1803,7 +1803,71 @@
     </w:p>
     <w:p>
       <w:pPr>
-        <w:spacing w:before="240" w:after="240"/>
+        <w:pStyle w:val="NormalWeb"/>
+        <w:spacing w:before="240" w:beforeAutospacing="0" w:after="240" w:afterAutospacing="0"/>
+        <w:jc w:val="both"/>
+      </w:pPr>
+      <w:r>
+        <w:rPr>
+          <w:noProof/>
+          <w:color w:val="000000"/>
+          <w:bdr w:val="none" w:sz="0" w:space="0" w:color="auto" w:frame="1"/>
+        </w:rPr>
+        <w:lastRenderedPageBreak/>
+        <w:drawing>
+          <wp:inline distT="0" distB="0" distL="0" distR="0" wp14:anchorId="444F2E83" wp14:editId="11E01741">
+            <wp:extent cx="4546600" cy="4089400"/>
+            <wp:effectExtent l="0" t="0" r="0" b="0"/>
+            <wp:docPr id="2110430289" name="Imagen 1"/>
+            <wp:cNvGraphicFramePr>
+              <a:graphicFrameLocks xmlns:a="http://schemas.openxmlformats.org/drawingml/2006/main" noChangeAspect="1"/>
+            </wp:cNvGraphicFramePr>
+            <a:graphic xmlns:a="http://schemas.openxmlformats.org/drawingml/2006/main">
+              <a:graphicData uri="http://schemas.openxmlformats.org/drawingml/2006/picture">
+                <pic:pic xmlns:pic="http://schemas.openxmlformats.org/drawingml/2006/picture">
+                  <pic:nvPicPr>
+                    <pic:cNvPr id="0" name="Picture 1"/>
+                    <pic:cNvPicPr>
+                      <a:picLocks noChangeAspect="1" noChangeArrowheads="1"/>
+                    </pic:cNvPicPr>
+                  </pic:nvPicPr>
+                  <pic:blipFill>
+                    <a:blip r:embed="rId8">
+                      <a:extLst>
+                        <a:ext uri="{28A0092B-C50C-407E-A947-70E740481C1C}">
+                          <a14:useLocalDpi xmlns:a14="http://schemas.microsoft.com/office/drawing/2010/main" val="0"/>
+                        </a:ext>
+                      </a:extLst>
+                    </a:blip>
+                    <a:srcRect/>
+                    <a:stretch>
+                      <a:fillRect/>
+                    </a:stretch>
+                  </pic:blipFill>
+                  <pic:spPr bwMode="auto">
+                    <a:xfrm>
+                      <a:off x="0" y="0"/>
+                      <a:ext cx="4546600" cy="4089400"/>
+                    </a:xfrm>
+                    <a:prstGeom prst="rect">
+                      <a:avLst/>
+                    </a:prstGeom>
+                    <a:noFill/>
+                    <a:ln>
+                      <a:noFill/>
+                    </a:ln>
+                  </pic:spPr>
+                </pic:pic>
+              </a:graphicData>
+            </a:graphic>
+          </wp:inline>
+        </w:drawing>
+      </w:r>
+    </w:p>
+    <w:p>
+      <w:pPr>
+        <w:pStyle w:val="NormalWeb"/>
+        <w:spacing w:before="240" w:beforeAutospacing="0" w:after="240" w:afterAutospacing="0"/>
         <w:jc w:val="both"/>
       </w:pPr>
       <w:r>
@@ -1812,730 +1876,9 @@
           <w:iCs/>
           <w:color w:val="000000"/>
         </w:rPr>
-        <w:lastRenderedPageBreak/>
-        <w:t xml:space="preserve">Tabla 1. Resumen efecto </w:t>
-      </w:r>
-      <w:proofErr w:type="spellStart"/>
-      <w:r>
-        <w:rPr>
-          <w:i/>
-          <w:iCs/>
-          <w:color w:val="000000"/>
-        </w:rPr>
-        <w:t>categorias</w:t>
-      </w:r>
-      <w:proofErr w:type="spellEnd"/>
-      <w:r>
-        <w:rPr>
-          <w:i/>
-          <w:iCs/>
-          <w:color w:val="000000"/>
-        </w:rPr>
-        <w:t xml:space="preserve"> por producto</w:t>
-      </w:r>
-    </w:p>
-    <w:tbl>
-      <w:tblPr>
-        <w:tblW w:w="9073" w:type="dxa"/>
-        <w:tblCellMar>
-          <w:top w:w="15" w:type="dxa"/>
-          <w:left w:w="15" w:type="dxa"/>
-          <w:bottom w:w="15" w:type="dxa"/>
-          <w:right w:w="15" w:type="dxa"/>
-        </w:tblCellMar>
-        <w:tblLook w:val="04A0" w:firstRow="1" w:lastRow="0" w:firstColumn="1" w:lastColumn="0" w:noHBand="0" w:noVBand="1"/>
-      </w:tblPr>
-      <w:tblGrid>
-        <w:gridCol w:w="2206"/>
-        <w:gridCol w:w="2451"/>
-        <w:gridCol w:w="4416"/>
-      </w:tblGrid>
-      <w:tr>
-        <w:trPr>
-          <w:trHeight w:val="168"/>
-        </w:trPr>
-        <w:tc>
-          <w:tcPr>
-            <w:tcW w:w="0" w:type="auto"/>
-            <w:tcBorders>
-              <w:top w:val="single" w:sz="4" w:space="0" w:color="000000"/>
-              <w:left w:val="single" w:sz="4" w:space="0" w:color="000000"/>
-              <w:bottom w:val="single" w:sz="4" w:space="0" w:color="000000"/>
-              <w:right w:val="single" w:sz="4" w:space="0" w:color="000000"/>
-            </w:tcBorders>
-            <w:tcMar>
-              <w:top w:w="100" w:type="dxa"/>
-              <w:left w:w="100" w:type="dxa"/>
-              <w:bottom w:w="100" w:type="dxa"/>
-              <w:right w:w="100" w:type="dxa"/>
-            </w:tcMar>
-            <w:hideMark/>
-          </w:tcPr>
-          <w:p>
-            <w:pPr>
-              <w:spacing w:before="240" w:after="240"/>
-              <w:jc w:val="both"/>
-            </w:pPr>
-            <w:r>
-              <w:rPr>
-                <w:b/>
-                <w:bCs/>
-                <w:color w:val="000000"/>
-              </w:rPr>
-              <w:t>Categoría</w:t>
-            </w:r>
-          </w:p>
-        </w:tc>
-        <w:tc>
-          <w:tcPr>
-            <w:tcW w:w="0" w:type="auto"/>
-            <w:tcBorders>
-              <w:top w:val="single" w:sz="4" w:space="0" w:color="000000"/>
-              <w:left w:val="single" w:sz="4" w:space="0" w:color="000000"/>
-              <w:bottom w:val="single" w:sz="4" w:space="0" w:color="000000"/>
-              <w:right w:val="single" w:sz="4" w:space="0" w:color="000000"/>
-            </w:tcBorders>
-            <w:tcMar>
-              <w:top w:w="100" w:type="dxa"/>
-              <w:left w:w="100" w:type="dxa"/>
-              <w:bottom w:w="100" w:type="dxa"/>
-              <w:right w:w="100" w:type="dxa"/>
-            </w:tcMar>
-            <w:hideMark/>
-          </w:tcPr>
-          <w:p>
-            <w:pPr>
-              <w:spacing w:before="240" w:after="240"/>
-              <w:jc w:val="both"/>
-            </w:pPr>
-            <w:r>
-              <w:rPr>
-                <w:b/>
-                <w:bCs/>
-                <w:color w:val="000000"/>
-              </w:rPr>
-              <w:t>Coeficiente</w:t>
-            </w:r>
-          </w:p>
-        </w:tc>
-        <w:tc>
-          <w:tcPr>
-            <w:tcW w:w="0" w:type="auto"/>
-            <w:tcBorders>
-              <w:top w:val="single" w:sz="4" w:space="0" w:color="000000"/>
-              <w:left w:val="single" w:sz="4" w:space="0" w:color="000000"/>
-              <w:bottom w:val="single" w:sz="4" w:space="0" w:color="000000"/>
-              <w:right w:val="single" w:sz="4" w:space="0" w:color="000000"/>
-            </w:tcBorders>
-            <w:tcMar>
-              <w:top w:w="100" w:type="dxa"/>
-              <w:left w:w="100" w:type="dxa"/>
-              <w:bottom w:w="100" w:type="dxa"/>
-              <w:right w:w="100" w:type="dxa"/>
-            </w:tcMar>
-            <w:hideMark/>
-          </w:tcPr>
-          <w:p>
-            <w:pPr>
-              <w:spacing w:before="240" w:after="240"/>
-              <w:jc w:val="both"/>
-            </w:pPr>
-            <w:r>
-              <w:rPr>
-                <w:b/>
-                <w:bCs/>
-                <w:color w:val="000000"/>
-              </w:rPr>
-              <w:t>Resultado</w:t>
-            </w:r>
-          </w:p>
-        </w:tc>
-      </w:tr>
-      <w:tr>
-        <w:trPr>
-          <w:trHeight w:val="388"/>
-        </w:trPr>
-        <w:tc>
-          <w:tcPr>
-            <w:tcW w:w="0" w:type="auto"/>
-            <w:tcBorders>
-              <w:top w:val="single" w:sz="4" w:space="0" w:color="000000"/>
-              <w:left w:val="single" w:sz="4" w:space="0" w:color="000000"/>
-              <w:bottom w:val="single" w:sz="4" w:space="0" w:color="000000"/>
-              <w:right w:val="single" w:sz="4" w:space="0" w:color="000000"/>
-            </w:tcBorders>
-            <w:tcMar>
-              <w:top w:w="100" w:type="dxa"/>
-              <w:left w:w="100" w:type="dxa"/>
-              <w:bottom w:w="100" w:type="dxa"/>
-              <w:right w:w="100" w:type="dxa"/>
-            </w:tcMar>
-            <w:hideMark/>
-          </w:tcPr>
-          <w:p>
-            <w:pPr>
-              <w:spacing w:before="240" w:after="240"/>
-              <w:jc w:val="both"/>
-            </w:pPr>
-            <w:proofErr w:type="spellStart"/>
-            <w:r>
-              <w:rPr>
-                <w:color w:val="000000"/>
-              </w:rPr>
-              <w:t>Jacket</w:t>
-            </w:r>
-            <w:proofErr w:type="spellEnd"/>
-          </w:p>
-        </w:tc>
-        <w:tc>
-          <w:tcPr>
-            <w:tcW w:w="0" w:type="auto"/>
-            <w:tcBorders>
-              <w:top w:val="single" w:sz="4" w:space="0" w:color="000000"/>
-              <w:left w:val="single" w:sz="4" w:space="0" w:color="000000"/>
-              <w:bottom w:val="single" w:sz="4" w:space="0" w:color="000000"/>
-              <w:right w:val="single" w:sz="4" w:space="0" w:color="000000"/>
-            </w:tcBorders>
-            <w:tcMar>
-              <w:top w:w="100" w:type="dxa"/>
-              <w:left w:w="100" w:type="dxa"/>
-              <w:bottom w:w="100" w:type="dxa"/>
-              <w:right w:w="100" w:type="dxa"/>
-            </w:tcMar>
-            <w:hideMark/>
-          </w:tcPr>
-          <w:p>
-            <w:pPr>
-              <w:spacing w:before="240" w:after="240"/>
-              <w:jc w:val="both"/>
-            </w:pPr>
-            <w:r>
-              <w:rPr>
-                <w:color w:val="000000"/>
-              </w:rPr>
-              <w:t>0.0704</w:t>
-            </w:r>
-          </w:p>
-        </w:tc>
-        <w:tc>
-          <w:tcPr>
-            <w:tcW w:w="0" w:type="auto"/>
-            <w:tcBorders>
-              <w:top w:val="single" w:sz="4" w:space="0" w:color="000000"/>
-              <w:left w:val="single" w:sz="4" w:space="0" w:color="000000"/>
-              <w:bottom w:val="single" w:sz="4" w:space="0" w:color="000000"/>
-              <w:right w:val="single" w:sz="4" w:space="0" w:color="000000"/>
-            </w:tcBorders>
-            <w:tcMar>
-              <w:top w:w="100" w:type="dxa"/>
-              <w:left w:w="100" w:type="dxa"/>
-              <w:bottom w:w="100" w:type="dxa"/>
-              <w:right w:w="100" w:type="dxa"/>
-            </w:tcMar>
-            <w:hideMark/>
-          </w:tcPr>
-          <w:p>
-            <w:pPr>
-              <w:spacing w:before="240" w:after="240"/>
-              <w:jc w:val="both"/>
-            </w:pPr>
-            <w:r>
-              <w:rPr>
-                <w:color w:val="000000"/>
-              </w:rPr>
-              <w:t>Positivo y significativo</w:t>
-            </w:r>
-          </w:p>
-        </w:tc>
-      </w:tr>
-      <w:tr>
-        <w:trPr>
-          <w:trHeight w:val="260"/>
-        </w:trPr>
-        <w:tc>
-          <w:tcPr>
-            <w:tcW w:w="0" w:type="auto"/>
-            <w:tcBorders>
-              <w:top w:val="single" w:sz="4" w:space="0" w:color="000000"/>
-              <w:left w:val="single" w:sz="4" w:space="0" w:color="000000"/>
-              <w:bottom w:val="single" w:sz="4" w:space="0" w:color="000000"/>
-              <w:right w:val="single" w:sz="4" w:space="0" w:color="000000"/>
-            </w:tcBorders>
-            <w:tcMar>
-              <w:top w:w="100" w:type="dxa"/>
-              <w:left w:w="100" w:type="dxa"/>
-              <w:bottom w:w="100" w:type="dxa"/>
-              <w:right w:w="100" w:type="dxa"/>
-            </w:tcMar>
-            <w:hideMark/>
-          </w:tcPr>
-          <w:p>
-            <w:pPr>
-              <w:spacing w:before="240" w:after="240"/>
-              <w:jc w:val="both"/>
-            </w:pPr>
-            <w:r>
-              <w:rPr>
-                <w:color w:val="000000"/>
-              </w:rPr>
-              <w:t>Jeans</w:t>
-            </w:r>
-          </w:p>
-        </w:tc>
-        <w:tc>
-          <w:tcPr>
-            <w:tcW w:w="0" w:type="auto"/>
-            <w:tcBorders>
-              <w:top w:val="single" w:sz="4" w:space="0" w:color="000000"/>
-              <w:left w:val="single" w:sz="4" w:space="0" w:color="000000"/>
-              <w:bottom w:val="single" w:sz="4" w:space="0" w:color="000000"/>
-              <w:right w:val="single" w:sz="4" w:space="0" w:color="000000"/>
-            </w:tcBorders>
-            <w:tcMar>
-              <w:top w:w="100" w:type="dxa"/>
-              <w:left w:w="100" w:type="dxa"/>
-              <w:bottom w:w="100" w:type="dxa"/>
-              <w:right w:w="100" w:type="dxa"/>
-            </w:tcMar>
-            <w:hideMark/>
-          </w:tcPr>
-          <w:p>
-            <w:pPr>
-              <w:spacing w:before="240" w:after="240"/>
-              <w:jc w:val="both"/>
-            </w:pPr>
-            <w:r>
-              <w:rPr>
-                <w:color w:val="000000"/>
-              </w:rPr>
-              <w:t>0.044</w:t>
-            </w:r>
-          </w:p>
-        </w:tc>
-        <w:tc>
-          <w:tcPr>
-            <w:tcW w:w="0" w:type="auto"/>
-            <w:tcBorders>
-              <w:top w:val="single" w:sz="4" w:space="0" w:color="000000"/>
-              <w:left w:val="single" w:sz="4" w:space="0" w:color="000000"/>
-              <w:bottom w:val="single" w:sz="4" w:space="0" w:color="000000"/>
-              <w:right w:val="single" w:sz="4" w:space="0" w:color="000000"/>
-            </w:tcBorders>
-            <w:tcMar>
-              <w:top w:w="100" w:type="dxa"/>
-              <w:left w:w="100" w:type="dxa"/>
-              <w:bottom w:w="100" w:type="dxa"/>
-              <w:right w:w="100" w:type="dxa"/>
-            </w:tcMar>
-            <w:hideMark/>
-          </w:tcPr>
-          <w:p>
-            <w:pPr>
-              <w:spacing w:before="240" w:after="240"/>
-              <w:jc w:val="both"/>
-            </w:pPr>
-            <w:r>
-              <w:rPr>
-                <w:color w:val="000000"/>
-              </w:rPr>
-              <w:t>Positivo marginal</w:t>
-            </w:r>
-          </w:p>
-        </w:tc>
-      </w:tr>
-      <w:tr>
-        <w:trPr>
-          <w:trHeight w:val="357"/>
-        </w:trPr>
-        <w:tc>
-          <w:tcPr>
-            <w:tcW w:w="0" w:type="auto"/>
-            <w:tcBorders>
-              <w:top w:val="single" w:sz="4" w:space="0" w:color="000000"/>
-              <w:left w:val="single" w:sz="4" w:space="0" w:color="000000"/>
-              <w:bottom w:val="single" w:sz="4" w:space="0" w:color="000000"/>
-              <w:right w:val="single" w:sz="4" w:space="0" w:color="000000"/>
-            </w:tcBorders>
-            <w:tcMar>
-              <w:top w:w="100" w:type="dxa"/>
-              <w:left w:w="100" w:type="dxa"/>
-              <w:bottom w:w="100" w:type="dxa"/>
-              <w:right w:w="100" w:type="dxa"/>
-            </w:tcMar>
-            <w:hideMark/>
-          </w:tcPr>
-          <w:p>
-            <w:pPr>
-              <w:spacing w:before="240" w:after="240"/>
-              <w:jc w:val="both"/>
-            </w:pPr>
-            <w:proofErr w:type="spellStart"/>
-            <w:r>
-              <w:rPr>
-                <w:color w:val="000000"/>
-              </w:rPr>
-              <w:t>Shoes</w:t>
-            </w:r>
-            <w:proofErr w:type="spellEnd"/>
-          </w:p>
-        </w:tc>
-        <w:tc>
-          <w:tcPr>
-            <w:tcW w:w="0" w:type="auto"/>
-            <w:tcBorders>
-              <w:top w:val="single" w:sz="4" w:space="0" w:color="000000"/>
-              <w:left w:val="single" w:sz="4" w:space="0" w:color="000000"/>
-              <w:bottom w:val="single" w:sz="4" w:space="0" w:color="000000"/>
-              <w:right w:val="single" w:sz="4" w:space="0" w:color="000000"/>
-            </w:tcBorders>
-            <w:tcMar>
-              <w:top w:w="100" w:type="dxa"/>
-              <w:left w:w="100" w:type="dxa"/>
-              <w:bottom w:w="100" w:type="dxa"/>
-              <w:right w:w="100" w:type="dxa"/>
-            </w:tcMar>
-            <w:hideMark/>
-          </w:tcPr>
-          <w:p>
-            <w:pPr>
-              <w:spacing w:before="240" w:after="240"/>
-              <w:jc w:val="both"/>
-            </w:pPr>
-            <w:r>
-              <w:rPr>
-                <w:color w:val="000000"/>
-              </w:rPr>
-              <w:t>0.1132</w:t>
-            </w:r>
-          </w:p>
-        </w:tc>
-        <w:tc>
-          <w:tcPr>
-            <w:tcW w:w="0" w:type="auto"/>
-            <w:tcBorders>
-              <w:top w:val="single" w:sz="4" w:space="0" w:color="000000"/>
-              <w:left w:val="single" w:sz="4" w:space="0" w:color="000000"/>
-              <w:bottom w:val="single" w:sz="4" w:space="0" w:color="000000"/>
-              <w:right w:val="single" w:sz="4" w:space="0" w:color="000000"/>
-            </w:tcBorders>
-            <w:tcMar>
-              <w:top w:w="100" w:type="dxa"/>
-              <w:left w:w="100" w:type="dxa"/>
-              <w:bottom w:w="100" w:type="dxa"/>
-              <w:right w:w="100" w:type="dxa"/>
-            </w:tcMar>
-            <w:hideMark/>
-          </w:tcPr>
-          <w:p>
-            <w:pPr>
-              <w:spacing w:before="240" w:after="240"/>
-              <w:jc w:val="both"/>
-            </w:pPr>
-            <w:r>
-              <w:rPr>
-                <w:color w:val="000000"/>
-              </w:rPr>
-              <w:t>Alto impacto positivo</w:t>
-            </w:r>
-          </w:p>
-        </w:tc>
-      </w:tr>
-      <w:tr>
-        <w:trPr>
-          <w:trHeight w:val="260"/>
-        </w:trPr>
-        <w:tc>
-          <w:tcPr>
-            <w:tcW w:w="0" w:type="auto"/>
-            <w:tcBorders>
-              <w:top w:val="single" w:sz="4" w:space="0" w:color="000000"/>
-              <w:left w:val="single" w:sz="4" w:space="0" w:color="000000"/>
-              <w:bottom w:val="single" w:sz="4" w:space="0" w:color="000000"/>
-              <w:right w:val="single" w:sz="4" w:space="0" w:color="000000"/>
-            </w:tcBorders>
-            <w:tcMar>
-              <w:top w:w="100" w:type="dxa"/>
-              <w:left w:w="100" w:type="dxa"/>
-              <w:bottom w:w="100" w:type="dxa"/>
-              <w:right w:w="100" w:type="dxa"/>
-            </w:tcMar>
-            <w:hideMark/>
-          </w:tcPr>
-          <w:p>
-            <w:pPr>
-              <w:spacing w:before="240" w:after="240"/>
-              <w:jc w:val="both"/>
-            </w:pPr>
-            <w:r>
-              <w:rPr>
-                <w:color w:val="000000"/>
-              </w:rPr>
-              <w:t>T-</w:t>
-            </w:r>
-            <w:proofErr w:type="spellStart"/>
-            <w:r>
-              <w:rPr>
-                <w:color w:val="000000"/>
-              </w:rPr>
-              <w:t>shirt</w:t>
-            </w:r>
-            <w:proofErr w:type="spellEnd"/>
-          </w:p>
-        </w:tc>
-        <w:tc>
-          <w:tcPr>
-            <w:tcW w:w="0" w:type="auto"/>
-            <w:tcBorders>
-              <w:top w:val="single" w:sz="4" w:space="0" w:color="000000"/>
-              <w:left w:val="single" w:sz="4" w:space="0" w:color="000000"/>
-              <w:bottom w:val="single" w:sz="4" w:space="0" w:color="000000"/>
-              <w:right w:val="single" w:sz="4" w:space="0" w:color="000000"/>
-            </w:tcBorders>
-            <w:tcMar>
-              <w:top w:w="100" w:type="dxa"/>
-              <w:left w:w="100" w:type="dxa"/>
-              <w:bottom w:w="100" w:type="dxa"/>
-              <w:right w:w="100" w:type="dxa"/>
-            </w:tcMar>
-            <w:hideMark/>
-          </w:tcPr>
-          <w:p>
-            <w:pPr>
-              <w:spacing w:before="240" w:after="240"/>
-              <w:jc w:val="both"/>
-            </w:pPr>
-            <w:r>
-              <w:rPr>
-                <w:color w:val="000000"/>
-              </w:rPr>
-              <w:t>-0.0385</w:t>
-            </w:r>
-          </w:p>
-        </w:tc>
-        <w:tc>
-          <w:tcPr>
-            <w:tcW w:w="0" w:type="auto"/>
-            <w:tcBorders>
-              <w:top w:val="single" w:sz="4" w:space="0" w:color="000000"/>
-              <w:left w:val="single" w:sz="4" w:space="0" w:color="000000"/>
-              <w:bottom w:val="single" w:sz="4" w:space="0" w:color="000000"/>
-              <w:right w:val="single" w:sz="4" w:space="0" w:color="000000"/>
-            </w:tcBorders>
-            <w:tcMar>
-              <w:top w:w="100" w:type="dxa"/>
-              <w:left w:w="100" w:type="dxa"/>
-              <w:bottom w:w="100" w:type="dxa"/>
-              <w:right w:w="100" w:type="dxa"/>
-            </w:tcMar>
-            <w:hideMark/>
-          </w:tcPr>
-          <w:p>
-            <w:pPr>
-              <w:spacing w:before="240" w:after="240"/>
-              <w:jc w:val="both"/>
-            </w:pPr>
-            <w:r>
-              <w:rPr>
-                <w:color w:val="000000"/>
-              </w:rPr>
-              <w:t>No significativo</w:t>
-            </w:r>
-          </w:p>
-        </w:tc>
-      </w:tr>
-      <w:tr>
-        <w:trPr>
-          <w:trHeight w:val="260"/>
-        </w:trPr>
-        <w:tc>
-          <w:tcPr>
-            <w:tcW w:w="0" w:type="auto"/>
-            <w:tcBorders>
-              <w:top w:val="single" w:sz="4" w:space="0" w:color="000000"/>
-              <w:left w:val="single" w:sz="4" w:space="0" w:color="000000"/>
-              <w:bottom w:val="single" w:sz="4" w:space="0" w:color="000000"/>
-              <w:right w:val="single" w:sz="4" w:space="0" w:color="000000"/>
-            </w:tcBorders>
-            <w:tcMar>
-              <w:top w:w="100" w:type="dxa"/>
-              <w:left w:w="100" w:type="dxa"/>
-              <w:bottom w:w="100" w:type="dxa"/>
-              <w:right w:w="100" w:type="dxa"/>
-            </w:tcMar>
-            <w:hideMark/>
-          </w:tcPr>
-          <w:p>
-            <w:pPr>
-              <w:spacing w:before="240" w:after="240"/>
-              <w:jc w:val="both"/>
-            </w:pPr>
-            <w:r>
-              <w:rPr>
-                <w:color w:val="000000"/>
-              </w:rPr>
-              <w:t>Top</w:t>
-            </w:r>
-          </w:p>
-        </w:tc>
-        <w:tc>
-          <w:tcPr>
-            <w:tcW w:w="0" w:type="auto"/>
-            <w:tcBorders>
-              <w:top w:val="single" w:sz="4" w:space="0" w:color="000000"/>
-              <w:left w:val="single" w:sz="4" w:space="0" w:color="000000"/>
-              <w:bottom w:val="single" w:sz="4" w:space="0" w:color="000000"/>
-              <w:right w:val="single" w:sz="4" w:space="0" w:color="000000"/>
-            </w:tcBorders>
-            <w:tcMar>
-              <w:top w:w="100" w:type="dxa"/>
-              <w:left w:w="100" w:type="dxa"/>
-              <w:bottom w:w="100" w:type="dxa"/>
-              <w:right w:w="100" w:type="dxa"/>
-            </w:tcMar>
-            <w:hideMark/>
-          </w:tcPr>
-          <w:p>
-            <w:pPr>
-              <w:spacing w:before="240" w:after="240"/>
-              <w:jc w:val="both"/>
-            </w:pPr>
-            <w:r>
-              <w:rPr>
-                <w:color w:val="000000"/>
-              </w:rPr>
-              <w:t>-0.0848</w:t>
-            </w:r>
-          </w:p>
-        </w:tc>
-        <w:tc>
-          <w:tcPr>
-            <w:tcW w:w="0" w:type="auto"/>
-            <w:tcBorders>
-              <w:top w:val="single" w:sz="4" w:space="0" w:color="000000"/>
-              <w:left w:val="single" w:sz="4" w:space="0" w:color="000000"/>
-              <w:bottom w:val="single" w:sz="4" w:space="0" w:color="000000"/>
-              <w:right w:val="single" w:sz="4" w:space="0" w:color="000000"/>
-            </w:tcBorders>
-            <w:tcMar>
-              <w:top w:w="100" w:type="dxa"/>
-              <w:left w:w="100" w:type="dxa"/>
-              <w:bottom w:w="100" w:type="dxa"/>
-              <w:right w:w="100" w:type="dxa"/>
-            </w:tcMar>
-            <w:hideMark/>
-          </w:tcPr>
-          <w:p>
-            <w:pPr>
-              <w:spacing w:before="240" w:after="240"/>
-              <w:jc w:val="both"/>
-            </w:pPr>
-            <w:r>
-              <w:rPr>
-                <w:color w:val="000000"/>
-              </w:rPr>
-              <w:t>Negativo significativo</w:t>
-            </w:r>
-          </w:p>
-        </w:tc>
-      </w:tr>
-      <w:tr>
-        <w:trPr>
-          <w:trHeight w:val="17"/>
-        </w:trPr>
-        <w:tc>
-          <w:tcPr>
-            <w:tcW w:w="0" w:type="auto"/>
-            <w:tcBorders>
-              <w:top w:val="single" w:sz="4" w:space="0" w:color="000000"/>
-              <w:left w:val="single" w:sz="4" w:space="0" w:color="000000"/>
-              <w:bottom w:val="single" w:sz="4" w:space="0" w:color="000000"/>
-              <w:right w:val="single" w:sz="4" w:space="0" w:color="000000"/>
-            </w:tcBorders>
-            <w:tcMar>
-              <w:top w:w="100" w:type="dxa"/>
-              <w:left w:w="100" w:type="dxa"/>
-              <w:bottom w:w="100" w:type="dxa"/>
-              <w:right w:w="100" w:type="dxa"/>
-            </w:tcMar>
-            <w:hideMark/>
-          </w:tcPr>
-          <w:p>
-            <w:pPr>
-              <w:spacing w:before="240" w:after="240"/>
-              <w:jc w:val="both"/>
-            </w:pPr>
-            <w:proofErr w:type="spellStart"/>
-            <w:r>
-              <w:rPr>
-                <w:color w:val="000000"/>
-              </w:rPr>
-              <w:t>Trainers</w:t>
-            </w:r>
-            <w:proofErr w:type="spellEnd"/>
-          </w:p>
-        </w:tc>
-        <w:tc>
-          <w:tcPr>
-            <w:tcW w:w="0" w:type="auto"/>
-            <w:tcBorders>
-              <w:top w:val="single" w:sz="4" w:space="0" w:color="000000"/>
-              <w:left w:val="single" w:sz="4" w:space="0" w:color="000000"/>
-              <w:bottom w:val="single" w:sz="4" w:space="0" w:color="000000"/>
-              <w:right w:val="single" w:sz="4" w:space="0" w:color="000000"/>
-            </w:tcBorders>
-            <w:tcMar>
-              <w:top w:w="100" w:type="dxa"/>
-              <w:left w:w="100" w:type="dxa"/>
-              <w:bottom w:w="100" w:type="dxa"/>
-              <w:right w:w="100" w:type="dxa"/>
-            </w:tcMar>
-            <w:hideMark/>
-          </w:tcPr>
-          <w:p>
-            <w:pPr>
-              <w:spacing w:before="240" w:after="240"/>
-              <w:jc w:val="both"/>
-            </w:pPr>
-            <w:r>
-              <w:rPr>
-                <w:color w:val="000000"/>
-              </w:rPr>
-              <w:t>0.1124</w:t>
-            </w:r>
-          </w:p>
-        </w:tc>
-        <w:tc>
-          <w:tcPr>
-            <w:tcW w:w="0" w:type="auto"/>
-            <w:tcBorders>
-              <w:top w:val="single" w:sz="4" w:space="0" w:color="000000"/>
-              <w:left w:val="single" w:sz="4" w:space="0" w:color="000000"/>
-              <w:bottom w:val="single" w:sz="4" w:space="0" w:color="000000"/>
-              <w:right w:val="single" w:sz="4" w:space="0" w:color="000000"/>
-            </w:tcBorders>
-            <w:tcMar>
-              <w:top w:w="100" w:type="dxa"/>
-              <w:left w:w="100" w:type="dxa"/>
-              <w:bottom w:w="100" w:type="dxa"/>
-              <w:right w:w="100" w:type="dxa"/>
-            </w:tcMar>
-            <w:hideMark/>
-          </w:tcPr>
-          <w:p>
-            <w:pPr>
-              <w:spacing w:before="240" w:after="240"/>
-              <w:jc w:val="both"/>
-            </w:pPr>
-            <w:r>
-              <w:rPr>
-                <w:color w:val="000000"/>
-              </w:rPr>
-              <w:t>Alto impacto positivo</w:t>
-            </w:r>
-          </w:p>
-        </w:tc>
-      </w:tr>
-    </w:tbl>
+        <w:t xml:space="preserve">Tabla 1. Resumen estadístico variables </w:t>
+      </w:r>
+    </w:p>
     <w:p>
       <w:pPr>
         <w:spacing w:before="240" w:after="240"/>
@@ -3197,6 +2540,15 @@
         </w:tc>
       </w:tr>
     </w:tbl>
+    <w:p>
+      <w:pPr>
+        <w:ind w:left="720"/>
+        <w:textAlignment w:val="baseline"/>
+        <w:rPr>
+          <w:color w:val="000000"/>
+        </w:rPr>
+      </w:pPr>
+    </w:p>
     <w:p>
       <w:pPr>
         <w:numPr>
@@ -5309,7 +4661,6 @@
     <w:name w:val="Normal (Web)"/>
     <w:basedOn w:val="Normal"/>
     <w:uiPriority w:val="99"/>
-    <w:semiHidden/>
     <w:unhideWhenUsed/>
     <w:rsid w:val="00506AD4"/>
     <w:pPr>

</xml_diff>

<commit_message>
Update Proyecto final Analítica.docx
</commit_message>
<xml_diff>
--- a/Proyecto final Analítica.docx
+++ b/Proyecto final Analítica.docx
@@ -1,6 +1,6 @@
 
 <file path=word/document.xml><?xml version="1.0" encoding="utf-8"?>
-<w:document xmlns:wpc="http://schemas.microsoft.com/office/word/2010/wordprocessingCanvas" xmlns:cx="http://schemas.microsoft.com/office/drawing/2014/chartex" xmlns:cx1="http://schemas.microsoft.com/office/drawing/2015/9/8/chartex" xmlns:cx2="http://schemas.microsoft.com/office/drawing/2015/10/21/chartex" xmlns:cx3="http://schemas.microsoft.com/office/drawing/2016/5/9/chartex" xmlns:cx4="http://schemas.microsoft.com/office/drawing/2016/5/10/chartex" xmlns:cx5="http://schemas.microsoft.com/office/drawing/2016/5/11/chartex" xmlns:cx6="http://schemas.microsoft.com/office/drawing/2016/5/12/chartex" xmlns:cx7="http://schemas.microsoft.com/office/drawing/2016/5/13/chartex" xmlns:cx8="http://schemas.microsoft.com/office/drawing/2016/5/14/chartex" xmlns:mc="http://schemas.openxmlformats.org/markup-compatibility/2006" xmlns:aink="http://schemas.microsoft.com/office/drawing/2016/ink" xmlns:am3d="http://schemas.microsoft.com/office/drawing/2017/model3d" xmlns:o="urn:schemas-microsoft-com:office:office" xmlns:oel="http://schemas.microsoft.com/office/2019/extlst" xmlns:r="http://schemas.openxmlformats.org/officeDocument/2006/relationships" xmlns:m="http://schemas.openxmlformats.org/officeDocument/2006/math" xmlns:v="urn:schemas-microsoft-com:vml" xmlns:wp14="http://schemas.microsoft.com/office/word/2010/wordprocessingDrawing" xmlns:wp="http://schemas.openxmlformats.org/drawingml/2006/wordprocessingDrawing" xmlns:w10="urn:schemas-microsoft-com:office:word" xmlns:w="http://schemas.openxmlformats.org/wordprocessingml/2006/main" xmlns:w14="http://schemas.microsoft.com/office/word/2010/wordml" xmlns:w15="http://schemas.microsoft.com/office/word/2012/wordml" xmlns:w16cex="http://schemas.microsoft.com/office/word/2018/wordml/cex" xmlns:w16cid="http://schemas.microsoft.com/office/word/2016/wordml/cid" xmlns:w16="http://schemas.microsoft.com/office/word/2018/wordml" xmlns:w16du="http://schemas.microsoft.com/office/word/2023/wordml/word16du" xmlns:w16sdtdh="http://schemas.microsoft.com/office/word/2020/wordml/sdtdatahash" xmlns:w16sdtfl="http://schemas.microsoft.com/office/word/2024/wordml/sdtformatlock" xmlns:w16se="http://schemas.microsoft.com/office/word/2015/wordml/symex" xmlns:wpg="http://schemas.microsoft.com/office/word/2010/wordprocessingGroup" xmlns:wpi="http://schemas.microsoft.com/office/word/2010/wordprocessingInk" xmlns:wne="http://schemas.microsoft.com/office/word/2006/wordml" xmlns:wps="http://schemas.microsoft.com/office/word/2010/wordprocessingShape" mc:Ignorable="w14 w15 w16se w16cid w16 w16cex w16sdtdh w16sdtfl w16du wp14">
+<w:document xmlns:wpc="http://schemas.microsoft.com/office/word/2010/wordprocessingCanvas" xmlns:cx="http://schemas.microsoft.com/office/drawing/2014/chartex" xmlns:cx1="http://schemas.microsoft.com/office/drawing/2015/9/8/chartex" xmlns:cx2="http://schemas.microsoft.com/office/drawing/2015/10/21/chartex" xmlns:cx3="http://schemas.microsoft.com/office/drawing/2016/5/9/chartex" xmlns:cx4="http://schemas.microsoft.com/office/drawing/2016/5/10/chartex" xmlns:cx5="http://schemas.microsoft.com/office/drawing/2016/5/11/chartex" xmlns:cx6="http://schemas.microsoft.com/office/drawing/2016/5/12/chartex" xmlns:cx7="http://schemas.microsoft.com/office/drawing/2016/5/13/chartex" xmlns:cx8="http://schemas.microsoft.com/office/drawing/2016/5/14/chartex" xmlns:mc="http://schemas.openxmlformats.org/markup-compatibility/2006" xmlns:aink="http://schemas.microsoft.com/office/drawing/2016/ink" xmlns:am3d="http://schemas.microsoft.com/office/drawing/2017/model3d" xmlns:o="urn:schemas-microsoft-com:office:office" xmlns:r="http://schemas.openxmlformats.org/officeDocument/2006/relationships" xmlns:m="http://schemas.openxmlformats.org/officeDocument/2006/math" xmlns:v="urn:schemas-microsoft-com:vml" xmlns:wp14="http://schemas.microsoft.com/office/word/2010/wordprocessingDrawing" xmlns:wp="http://schemas.openxmlformats.org/drawingml/2006/wordprocessingDrawing" xmlns:w10="urn:schemas-microsoft-com:office:word" xmlns:w="http://schemas.openxmlformats.org/wordprocessingml/2006/main" xmlns:w14="http://schemas.microsoft.com/office/word/2010/wordml" xmlns:w15="http://schemas.microsoft.com/office/word/2012/wordml" xmlns:w16cex="http://schemas.microsoft.com/office/word/2018/wordml/cex" xmlns:w16cid="http://schemas.microsoft.com/office/word/2016/wordml/cid" xmlns:w16="http://schemas.microsoft.com/office/word/2018/wordml" xmlns:w16se="http://schemas.microsoft.com/office/word/2015/wordml/symex" xmlns:wpg="http://schemas.microsoft.com/office/word/2010/wordprocessingGroup" xmlns:wpi="http://schemas.microsoft.com/office/word/2010/wordprocessingInk" xmlns:wne="http://schemas.microsoft.com/office/word/2006/wordml" xmlns:wps="http://schemas.microsoft.com/office/word/2010/wordprocessingShape" mc:Ignorable="w14 w15 w16se w16cid w16 w16cex wp14">
   <w:body>
     <w:p>
       <w:pPr>
@@ -650,7 +650,21 @@
         <w:rPr>
           <w:color w:val="000000"/>
         </w:rPr>
-        <w:t xml:space="preserve"> interactivo en Shiny que facilita la visualización y exploración de resultados para la toma de decisiones empresariales.</w:t>
+        <w:t xml:space="preserve"> interactivo en </w:t>
+      </w:r>
+      <w:proofErr w:type="spellStart"/>
+      <w:r>
+        <w:rPr>
+          <w:color w:val="000000"/>
+        </w:rPr>
+        <w:t>Shiny</w:t>
+      </w:r>
+      <w:proofErr w:type="spellEnd"/>
+      <w:r>
+        <w:rPr>
+          <w:color w:val="000000"/>
+        </w:rPr>
+        <w:t xml:space="preserve"> que facilita la visualización y exploración de resultados para la toma de decisiones empresariales.</w:t>
       </w:r>
     </w:p>
     <w:p>
@@ -2663,15 +2677,402 @@
     </w:p>
     <w:p>
       <w:pPr>
+        <w:pStyle w:val="NormalWeb"/>
+        <w:spacing w:before="240" w:beforeAutospacing="0" w:after="240" w:afterAutospacing="0"/>
+        <w:jc w:val="both"/>
+        <w:rPr>
+          <w:lang w:eastAsia="en-US"/>
+        </w:rPr>
+      </w:pPr>
+      <w:r>
+        <w:rPr>
+          <w:color w:val="000000"/>
+        </w:rPr>
+        <w:t xml:space="preserve">Como se mencionó, la marca Brand_4 presenta un efecto negativo significativo sobre las ventas. Esto podría estar asociado a problemas de posicionamiento, menor percepción de calidad, estrategias de marketing poco efectivas, menor reconocimiento de marca y/o precios poco competitivos. Siendo así, el resultado evidencia una posible desventaja competitiva </w:t>
+      </w:r>
+      <w:r>
+        <w:rPr>
+          <w:color w:val="000000"/>
+        </w:rPr>
+        <w:lastRenderedPageBreak/>
+        <w:t>frente a las demás marcas analizadas.</w:t>
+      </w:r>
+      <w:r>
+        <w:rPr>
+          <w:color w:val="000000"/>
+        </w:rPr>
+        <w:t xml:space="preserve"> </w:t>
+      </w:r>
+      <w:r>
+        <w:rPr>
+          <w:noProof/>
+          <w:color w:val="000000"/>
+        </w:rPr>
+        <w:drawing>
+          <wp:inline distT="0" distB="0" distL="0" distR="0" wp14:anchorId="4741E634" wp14:editId="0BE111BB">
+            <wp:extent cx="4559300" cy="4083050"/>
+            <wp:effectExtent l="0" t="0" r="0" b="0"/>
+            <wp:docPr id="2" name="Imagen 2"/>
+            <wp:cNvGraphicFramePr>
+              <a:graphicFrameLocks xmlns:a="http://schemas.openxmlformats.org/drawingml/2006/main" noChangeAspect="1"/>
+            </wp:cNvGraphicFramePr>
+            <a:graphic xmlns:a="http://schemas.openxmlformats.org/drawingml/2006/main">
+              <a:graphicData uri="http://schemas.openxmlformats.org/drawingml/2006/picture">
+                <pic:pic xmlns:pic="http://schemas.openxmlformats.org/drawingml/2006/picture">
+                  <pic:nvPicPr>
+                    <pic:cNvPr id="0" name="Picture 1"/>
+                    <pic:cNvPicPr>
+                      <a:picLocks noChangeAspect="1" noChangeArrowheads="1"/>
+                    </pic:cNvPicPr>
+                  </pic:nvPicPr>
+                  <pic:blipFill>
+                    <a:blip r:embed="rId9">
+                      <a:extLst>
+                        <a:ext uri="{28A0092B-C50C-407E-A947-70E740481C1C}">
+                          <a14:useLocalDpi xmlns:a14="http://schemas.microsoft.com/office/drawing/2010/main" val="0"/>
+                        </a:ext>
+                      </a:extLst>
+                    </a:blip>
+                    <a:srcRect/>
+                    <a:stretch>
+                      <a:fillRect/>
+                    </a:stretch>
+                  </pic:blipFill>
+                  <pic:spPr bwMode="auto">
+                    <a:xfrm>
+                      <a:off x="0" y="0"/>
+                      <a:ext cx="4559300" cy="4083050"/>
+                    </a:xfrm>
+                    <a:prstGeom prst="rect">
+                      <a:avLst/>
+                    </a:prstGeom>
+                    <a:noFill/>
+                    <a:ln>
+                      <a:noFill/>
+                    </a:ln>
+                  </pic:spPr>
+                </pic:pic>
+              </a:graphicData>
+            </a:graphic>
+          </wp:inline>
+        </w:drawing>
+      </w:r>
+    </w:p>
+    <w:p>
+      <w:pPr>
+        <w:pStyle w:val="Ttulo1"/>
+        <w:spacing w:before="480" w:after="120"/>
+        <w:jc w:val="both"/>
+        <w:rPr>
+          <w:rFonts w:ascii="Times New Roman" w:hAnsi="Times New Roman" w:cs="Times New Roman"/>
+        </w:rPr>
+      </w:pPr>
+      <w:r>
+        <w:rPr>
+          <w:rFonts w:ascii="Times New Roman" w:hAnsi="Times New Roman" w:cs="Times New Roman"/>
+          <w:color w:val="000000"/>
+          <w:sz w:val="24"/>
+          <w:szCs w:val="24"/>
+        </w:rPr>
+        <w:t>6. Calidad y Robustez del Modelo</w:t>
+      </w:r>
+    </w:p>
+    <w:p>
+      <w:pPr>
+        <w:pStyle w:val="NormalWeb"/>
+        <w:spacing w:before="240" w:beforeAutospacing="0" w:after="240" w:afterAutospacing="0"/>
+        <w:jc w:val="both"/>
+      </w:pPr>
+      <w:r>
+        <w:rPr>
+          <w:color w:val="000000"/>
+        </w:rPr>
+        <w:t>El modelo fue sometido a diferentes pruebas estadísticas para validar su consistencia y robustez econométrica.</w:t>
+      </w:r>
+    </w:p>
+    <w:p>
+      <w:pPr>
+        <w:pStyle w:val="NormalWeb"/>
+        <w:spacing w:before="240" w:beforeAutospacing="0" w:after="240" w:afterAutospacing="0"/>
+        <w:jc w:val="both"/>
+      </w:pPr>
+      <w:r>
+        <w:rPr>
+          <w:noProof/>
+          <w:color w:val="000000"/>
+        </w:rPr>
+        <w:lastRenderedPageBreak/>
+        <w:drawing>
+          <wp:inline distT="0" distB="0" distL="0" distR="0" wp14:anchorId="46292624" wp14:editId="52C88705">
+            <wp:extent cx="4375150" cy="3752850"/>
+            <wp:effectExtent l="0" t="0" r="6350" b="0"/>
+            <wp:docPr id="1" name="Imagen 1"/>
+            <wp:cNvGraphicFramePr>
+              <a:graphicFrameLocks xmlns:a="http://schemas.openxmlformats.org/drawingml/2006/main" noChangeAspect="1"/>
+            </wp:cNvGraphicFramePr>
+            <a:graphic xmlns:a="http://schemas.openxmlformats.org/drawingml/2006/main">
+              <a:graphicData uri="http://schemas.openxmlformats.org/drawingml/2006/picture">
+                <pic:pic xmlns:pic="http://schemas.openxmlformats.org/drawingml/2006/picture">
+                  <pic:nvPicPr>
+                    <pic:cNvPr id="0" name="Picture 2"/>
+                    <pic:cNvPicPr>
+                      <a:picLocks noChangeAspect="1" noChangeArrowheads="1"/>
+                    </pic:cNvPicPr>
+                  </pic:nvPicPr>
+                  <pic:blipFill>
+                    <a:blip r:embed="rId10">
+                      <a:extLst>
+                        <a:ext uri="{28A0092B-C50C-407E-A947-70E740481C1C}">
+                          <a14:useLocalDpi xmlns:a14="http://schemas.microsoft.com/office/drawing/2010/main" val="0"/>
+                        </a:ext>
+                      </a:extLst>
+                    </a:blip>
+                    <a:srcRect/>
+                    <a:stretch>
+                      <a:fillRect/>
+                    </a:stretch>
+                  </pic:blipFill>
+                  <pic:spPr bwMode="auto">
+                    <a:xfrm>
+                      <a:off x="0" y="0"/>
+                      <a:ext cx="4375150" cy="3752850"/>
+                    </a:xfrm>
+                    <a:prstGeom prst="rect">
+                      <a:avLst/>
+                    </a:prstGeom>
+                    <a:noFill/>
+                    <a:ln>
+                      <a:noFill/>
+                    </a:ln>
+                  </pic:spPr>
+                </pic:pic>
+              </a:graphicData>
+            </a:graphic>
+          </wp:inline>
+        </w:drawing>
+      </w:r>
+    </w:p>
+    <w:p>
+      <w:pPr>
+        <w:pStyle w:val="NormalWeb"/>
+        <w:spacing w:before="240" w:beforeAutospacing="0" w:after="240" w:afterAutospacing="0"/>
+        <w:jc w:val="both"/>
+      </w:pPr>
+      <w:r>
+        <w:rPr>
+          <w:i/>
+          <w:iCs/>
+          <w:color w:val="000000"/>
+        </w:rPr>
+        <w:t>Gráfica 2. Matriz de correlación entre variables numéricas</w:t>
+      </w:r>
+    </w:p>
+    <w:p>
+      <w:pPr>
+        <w:pStyle w:val="NormalWeb"/>
+        <w:spacing w:before="240" w:beforeAutospacing="0" w:after="240" w:afterAutospacing="0"/>
+        <w:jc w:val="both"/>
+      </w:pPr>
+      <w:r>
+        <w:rPr>
+          <w:color w:val="000000"/>
+        </w:rPr>
+        <w:t xml:space="preserve">El análisis de correlaciones a nivel SKU-día reveló una correlación de </w:t>
+      </w:r>
+      <w:r>
+        <w:rPr>
+          <w:b/>
+          <w:bCs/>
+          <w:color w:val="000000"/>
+        </w:rPr>
+        <w:t>r = -0.667</w:t>
+      </w:r>
+      <w:r>
+        <w:rPr>
+          <w:color w:val="000000"/>
+        </w:rPr>
+        <w:t xml:space="preserve"> entre el índice de precio y las ventas, confirmando una relación negativa fuerte y estadísticamente significativa donde los precios más altos tienden a asociarse con menores niveles de ventas. La variación de precio respecto al promedio del SKU mostró una correlación positiva con las ventas de </w:t>
+      </w:r>
+      <w:r>
+        <w:rPr>
+          <w:b/>
+          <w:bCs/>
+          <w:color w:val="000000"/>
+        </w:rPr>
+        <w:t>r = +0.578</w:t>
+      </w:r>
+      <w:r>
+        <w:rPr>
+          <w:color w:val="000000"/>
+        </w:rPr>
+        <w:t xml:space="preserve">, lo </w:t>
+      </w:r>
+      <w:proofErr w:type="gramStart"/>
+      <w:r>
+        <w:rPr>
+          <w:color w:val="000000"/>
+        </w:rPr>
+        <w:t>que</w:t>
+      </w:r>
+      <w:proofErr w:type="gramEnd"/>
+      <w:r>
+        <w:rPr>
+          <w:color w:val="000000"/>
+        </w:rPr>
+        <w:t xml:space="preserve"> valida el proxy de descuento implícito construido, es decir, cuando el precio cae por debajo del promedio histórico del producto, las ventas aumentan, indicando que reducciones relativas en el precio favorecen incrementos en la demanda.</w:t>
+      </w:r>
+    </w:p>
+    <w:p>
+      <w:pPr>
+        <w:pStyle w:val="NormalWeb"/>
+        <w:spacing w:before="240" w:beforeAutospacing="0" w:after="240" w:afterAutospacing="0"/>
+        <w:jc w:val="both"/>
+      </w:pPr>
+      <w:r>
+        <w:rPr>
+          <w:color w:val="000000"/>
+        </w:rPr>
+        <w:t>Por otro lado, el costo no presenta correlación significativa con las ventas (</w:t>
+      </w:r>
+      <w:r>
+        <w:rPr>
+          <w:b/>
+          <w:bCs/>
+          <w:color w:val="000000"/>
+        </w:rPr>
+        <w:t>r ≈ 0</w:t>
+      </w:r>
+      <w:r>
+        <w:rPr>
+          <w:color w:val="000000"/>
+        </w:rPr>
+        <w:t>), lo que es consistente con la teoría de que el consumidor no observa el costo interno, solo el precio final. En conjunto, estas correlaciones respaldan la hipótesis principal del proyecto: el precio constituye uno de los factores más relevantes para explicar el comportamiento de las ventas en el sector moda.</w:t>
+      </w:r>
+    </w:p>
+    <w:p>
+      <w:pPr>
+        <w:spacing w:after="240"/>
+        <w:jc w:val="both"/>
+      </w:pPr>
+    </w:p>
+    <w:p>
+      <w:pPr>
+        <w:pStyle w:val="Ttulo2"/>
+        <w:spacing w:before="360"/>
+        <w:jc w:val="both"/>
+        <w:rPr>
+          <w:rFonts w:ascii="Times New Roman" w:hAnsi="Times New Roman" w:cs="Times New Roman"/>
+        </w:rPr>
+      </w:pPr>
+      <w:r>
+        <w:rPr>
+          <w:rFonts w:ascii="Times New Roman" w:hAnsi="Times New Roman" w:cs="Times New Roman"/>
+          <w:color w:val="000000"/>
+          <w:sz w:val="24"/>
+          <w:szCs w:val="24"/>
+        </w:rPr>
+        <w:t>6.1 Pruebas de Robustez </w:t>
+      </w:r>
+    </w:p>
+    <w:p>
+      <w:pPr>
+        <w:pStyle w:val="NormalWeb"/>
+        <w:spacing w:before="240" w:beforeAutospacing="0" w:after="240" w:afterAutospacing="0"/>
+        <w:jc w:val="both"/>
+      </w:pPr>
+      <w:r>
+        <w:rPr>
+          <w:color w:val="000000"/>
+        </w:rPr>
+        <w:t>Se realizaron diferentes pruebas econométricas para validar la consistencia estadística del modelo estimado.</w:t>
+      </w:r>
+    </w:p>
+    <w:p>
+      <w:pPr>
+        <w:pStyle w:val="NormalWeb"/>
+        <w:spacing w:before="240" w:beforeAutospacing="0" w:after="240" w:afterAutospacing="0"/>
+        <w:jc w:val="both"/>
+      </w:pPr>
+      <w:r>
+        <w:rPr>
+          <w:color w:val="000000"/>
+        </w:rPr>
+        <w:lastRenderedPageBreak/>
+        <w:t xml:space="preserve">El test de </w:t>
+      </w:r>
+      <w:proofErr w:type="spellStart"/>
+      <w:r>
+        <w:rPr>
+          <w:color w:val="000000"/>
+        </w:rPr>
+        <w:t>Breusch</w:t>
+      </w:r>
+      <w:proofErr w:type="spellEnd"/>
+      <w:r>
+        <w:rPr>
+          <w:color w:val="000000"/>
+        </w:rPr>
+        <w:t>-Pagan arrojó un estadístico de 1465.43 con p &lt; 0.001, evidenciando la presencia de heterocedasticidad. Debido a ello, se utilizaron errores estándar robustos HC3 para corregir posibles sesgos en la inferencia estadística.</w:t>
+      </w:r>
+    </w:p>
+    <w:p>
+      <w:pPr>
+        <w:pStyle w:val="NormalWeb"/>
+        <w:spacing w:before="240" w:beforeAutospacing="0" w:after="240" w:afterAutospacing="0"/>
+        <w:jc w:val="both"/>
+      </w:pPr>
+      <w:r>
+        <w:rPr>
+          <w:color w:val="000000"/>
+        </w:rPr>
+        <w:t>El test de Durbin-Watson produjo un valor de 1.5405. Aunque el valor ideal es cercano a 2, el resultado indica únicamente una leve autocorrelación positiva, sin comprometer de manera severa la validez del modelo.</w:t>
+      </w:r>
+    </w:p>
+    <w:p>
+      <w:pPr>
+        <w:pStyle w:val="NormalWeb"/>
+        <w:spacing w:before="240" w:beforeAutospacing="0" w:after="240" w:afterAutospacing="0"/>
+        <w:jc w:val="both"/>
+      </w:pPr>
+      <w:r>
+        <w:rPr>
+          <w:color w:val="000000"/>
+        </w:rPr>
+        <w:t>Asimismo, el test de Jarque-</w:t>
+      </w:r>
+      <w:proofErr w:type="spellStart"/>
+      <w:r>
+        <w:rPr>
+          <w:color w:val="000000"/>
+        </w:rPr>
+        <w:t>Bera</w:t>
+      </w:r>
+      <w:proofErr w:type="spellEnd"/>
+      <w:r>
+        <w:rPr>
+          <w:color w:val="000000"/>
+        </w:rPr>
+        <w:t xml:space="preserve"> obtuvo un estadístico de 523.15 con p &lt; 0.001, indicando que los residuos no siguen una distribución normal. Sin embargo, dado el tamaño elevado de la muestra (n ≈ 11,200), el Teorema Central del Límite permite mantener la validez de las estimaciones e inferencias.</w:t>
+      </w:r>
+    </w:p>
+    <w:p>
+      <w:pPr>
+        <w:pStyle w:val="NormalWeb"/>
+        <w:spacing w:before="240" w:beforeAutospacing="0" w:after="240" w:afterAutospacing="0"/>
+        <w:jc w:val="both"/>
+      </w:pPr>
+      <w:r>
+        <w:rPr>
+          <w:color w:val="000000"/>
+        </w:rPr>
+        <w:t>Finalmente, el análisis de VIF no evidenció problemas severos de multicolinealidad, ya que los factores de inflación de varianza se mantuvieron por debajo de los niveles críticos.</w:t>
+      </w:r>
+    </w:p>
+    <w:p>
+      <w:pPr>
         <w:spacing w:before="240" w:after="240"/>
         <w:jc w:val="both"/>
       </w:pPr>
-      <w:r>
-        <w:rPr>
-          <w:color w:val="000000"/>
-        </w:rPr>
-        <w:t>Como se mencionó, la marca Brand_4 presenta un efecto negativo significativo sobre las ventas. Esto podría estar asociado a problemas de posicionamiento, menor percepción de calidad, estrategias de marketing poco efectivas, menor reconocimiento de marca y/o precios poco competitivos. Siendo así, el resultado evidencia una posible desventaja competitiva frente a las demás marcas analizadas.</w:t>
-      </w:r>
     </w:p>
     <w:p/>
     <w:p/>
@@ -2702,7 +3103,7 @@
 </file>
 
 <file path=word/numbering.xml><?xml version="1.0" encoding="utf-8"?>
-<w:numbering xmlns:wpc="http://schemas.microsoft.com/office/word/2010/wordprocessingCanvas" xmlns:cx="http://schemas.microsoft.com/office/drawing/2014/chartex" xmlns:cx1="http://schemas.microsoft.com/office/drawing/2015/9/8/chartex" xmlns:cx2="http://schemas.microsoft.com/office/drawing/2015/10/21/chartex" xmlns:cx3="http://schemas.microsoft.com/office/drawing/2016/5/9/chartex" xmlns:cx4="http://schemas.microsoft.com/office/drawing/2016/5/10/chartex" xmlns:cx5="http://schemas.microsoft.com/office/drawing/2016/5/11/chartex" xmlns:cx6="http://schemas.microsoft.com/office/drawing/2016/5/12/chartex" xmlns:cx7="http://schemas.microsoft.com/office/drawing/2016/5/13/chartex" xmlns:cx8="http://schemas.microsoft.com/office/drawing/2016/5/14/chartex" xmlns:mc="http://schemas.openxmlformats.org/markup-compatibility/2006" xmlns:aink="http://schemas.microsoft.com/office/drawing/2016/ink" xmlns:am3d="http://schemas.microsoft.com/office/drawing/2017/model3d" xmlns:o="urn:schemas-microsoft-com:office:office" xmlns:oel="http://schemas.microsoft.com/office/2019/extlst" xmlns:r="http://schemas.openxmlformats.org/officeDocument/2006/relationships" xmlns:m="http://schemas.openxmlformats.org/officeDocument/2006/math" xmlns:v="urn:schemas-microsoft-com:vml" xmlns:wp14="http://schemas.microsoft.com/office/word/2010/wordprocessingDrawing" xmlns:wp="http://schemas.openxmlformats.org/drawingml/2006/wordprocessingDrawing" xmlns:w10="urn:schemas-microsoft-com:office:word" xmlns:w="http://schemas.openxmlformats.org/wordprocessingml/2006/main" xmlns:w14="http://schemas.microsoft.com/office/word/2010/wordml" xmlns:w15="http://schemas.microsoft.com/office/word/2012/wordml" xmlns:w16cex="http://schemas.microsoft.com/office/word/2018/wordml/cex" xmlns:w16cid="http://schemas.microsoft.com/office/word/2016/wordml/cid" xmlns:w16="http://schemas.microsoft.com/office/word/2018/wordml" xmlns:w16du="http://schemas.microsoft.com/office/word/2023/wordml/word16du" xmlns:w16sdtdh="http://schemas.microsoft.com/office/word/2020/wordml/sdtdatahash" xmlns:w16sdtfl="http://schemas.microsoft.com/office/word/2024/wordml/sdtformatlock" xmlns:w16se="http://schemas.microsoft.com/office/word/2015/wordml/symex" xmlns:wpg="http://schemas.microsoft.com/office/word/2010/wordprocessingGroup" xmlns:wpi="http://schemas.microsoft.com/office/word/2010/wordprocessingInk" xmlns:wne="http://schemas.microsoft.com/office/word/2006/wordml" xmlns:wps="http://schemas.microsoft.com/office/word/2010/wordprocessingShape" mc:Ignorable="w14 w15 w16se w16cid w16 w16cex w16sdtdh w16sdtfl w16du wp14">
+<w:numbering xmlns:wpc="http://schemas.microsoft.com/office/word/2010/wordprocessingCanvas" xmlns:cx="http://schemas.microsoft.com/office/drawing/2014/chartex" xmlns:cx1="http://schemas.microsoft.com/office/drawing/2015/9/8/chartex" xmlns:cx2="http://schemas.microsoft.com/office/drawing/2015/10/21/chartex" xmlns:cx3="http://schemas.microsoft.com/office/drawing/2016/5/9/chartex" xmlns:cx4="http://schemas.microsoft.com/office/drawing/2016/5/10/chartex" xmlns:cx5="http://schemas.microsoft.com/office/drawing/2016/5/11/chartex" xmlns:cx6="http://schemas.microsoft.com/office/drawing/2016/5/12/chartex" xmlns:cx7="http://schemas.microsoft.com/office/drawing/2016/5/13/chartex" xmlns:cx8="http://schemas.microsoft.com/office/drawing/2016/5/14/chartex" xmlns:mc="http://schemas.openxmlformats.org/markup-compatibility/2006" xmlns:aink="http://schemas.microsoft.com/office/drawing/2016/ink" xmlns:am3d="http://schemas.microsoft.com/office/drawing/2017/model3d" xmlns:o="urn:schemas-microsoft-com:office:office" xmlns:r="http://schemas.openxmlformats.org/officeDocument/2006/relationships" xmlns:m="http://schemas.openxmlformats.org/officeDocument/2006/math" xmlns:v="urn:schemas-microsoft-com:vml" xmlns:wp14="http://schemas.microsoft.com/office/word/2010/wordprocessingDrawing" xmlns:wp="http://schemas.openxmlformats.org/drawingml/2006/wordprocessingDrawing" xmlns:w10="urn:schemas-microsoft-com:office:word" xmlns:w="http://schemas.openxmlformats.org/wordprocessingml/2006/main" xmlns:w14="http://schemas.microsoft.com/office/word/2010/wordml" xmlns:w15="http://schemas.microsoft.com/office/word/2012/wordml" xmlns:w16cex="http://schemas.microsoft.com/office/word/2018/wordml/cex" xmlns:w16cid="http://schemas.microsoft.com/office/word/2016/wordml/cid" xmlns:w16="http://schemas.microsoft.com/office/word/2018/wordml" xmlns:w16se="http://schemas.microsoft.com/office/word/2015/wordml/symex" xmlns:wpg="http://schemas.microsoft.com/office/word/2010/wordprocessingGroup" xmlns:wpi="http://schemas.microsoft.com/office/word/2010/wordprocessingInk" xmlns:wne="http://schemas.microsoft.com/office/word/2006/wordml" xmlns:wps="http://schemas.microsoft.com/office/word/2010/wordprocessingShape" mc:Ignorable="w14 w15 w16se w16cid w16 w16cex wp14">
   <w:abstractNum w:abstractNumId="0" w15:restartNumberingAfterBreak="0">
     <w:nsid w:val="0D6514A4"/>
     <w:multiLevelType w:val="multilevel"/>
@@ -3710,32 +4111,32 @@
       </w:rPr>
     </w:lvl>
   </w:abstractNum>
-  <w:num w:numId="1" w16cid:durableId="363023352">
+  <w:num w:numId="1">
     <w:abstractNumId w:val="2"/>
   </w:num>
-  <w:num w:numId="2" w16cid:durableId="951858285">
+  <w:num w:numId="2">
     <w:abstractNumId w:val="1"/>
   </w:num>
-  <w:num w:numId="3" w16cid:durableId="2091005357">
+  <w:num w:numId="3">
     <w:abstractNumId w:val="6"/>
   </w:num>
-  <w:num w:numId="4" w16cid:durableId="196509368">
+  <w:num w:numId="4">
     <w:abstractNumId w:val="5"/>
   </w:num>
-  <w:num w:numId="5" w16cid:durableId="1762025039">
+  <w:num w:numId="5">
     <w:abstractNumId w:val="4"/>
   </w:num>
-  <w:num w:numId="6" w16cid:durableId="668368146">
+  <w:num w:numId="6">
     <w:abstractNumId w:val="0"/>
   </w:num>
-  <w:num w:numId="7" w16cid:durableId="1177845322">
+  <w:num w:numId="7">
     <w:abstractNumId w:val="3"/>
   </w:num>
 </w:numbering>
 </file>
 
 <file path=word/styles.xml><?xml version="1.0" encoding="utf-8"?>
-<w:styles xmlns:mc="http://schemas.openxmlformats.org/markup-compatibility/2006" xmlns:r="http://schemas.openxmlformats.org/officeDocument/2006/relationships" xmlns:w="http://schemas.openxmlformats.org/wordprocessingml/2006/main" xmlns:w14="http://schemas.microsoft.com/office/word/2010/wordml" xmlns:w15="http://schemas.microsoft.com/office/word/2012/wordml" xmlns:w16cex="http://schemas.microsoft.com/office/word/2018/wordml/cex" xmlns:w16cid="http://schemas.microsoft.com/office/word/2016/wordml/cid" xmlns:w16="http://schemas.microsoft.com/office/word/2018/wordml" xmlns:w16du="http://schemas.microsoft.com/office/word/2023/wordml/word16du" xmlns:w16sdtdh="http://schemas.microsoft.com/office/word/2020/wordml/sdtdatahash" xmlns:w16sdtfl="http://schemas.microsoft.com/office/word/2024/wordml/sdtformatlock" xmlns:w16se="http://schemas.microsoft.com/office/word/2015/wordml/symex" mc:Ignorable="w14 w15 w16se w16cid w16 w16cex w16sdtdh w16sdtfl w16du">
+<w:styles xmlns:mc="http://schemas.openxmlformats.org/markup-compatibility/2006" xmlns:r="http://schemas.openxmlformats.org/officeDocument/2006/relationships" xmlns:w="http://schemas.openxmlformats.org/wordprocessingml/2006/main" xmlns:w14="http://schemas.microsoft.com/office/word/2010/wordml" xmlns:w15="http://schemas.microsoft.com/office/word/2012/wordml" xmlns:w16cex="http://schemas.microsoft.com/office/word/2018/wordml/cex" xmlns:w16cid="http://schemas.microsoft.com/office/word/2016/wordml/cid" xmlns:w16="http://schemas.microsoft.com/office/word/2018/wordml" xmlns:w16se="http://schemas.microsoft.com/office/word/2015/wordml/symex" mc:Ignorable="w14 w15 w16se w16cid w16 w16cex">
   <w:docDefaults>
     <w:rPrDefault>
       <w:rPr>

</xml_diff>